<commit_message>
Afstanden til Månen: ny del med pendul, måned og Newtons tyngdelov
Mål g med et pendul, GM = gR², og find D af Keplers 3. lov med den
sideriske måned. Lommeregner på siden, advarsel mod cirkelslutning
ved vejning, og del 2 med udregnet eksempel og facit i
øvelsesvejledningen.

Co-Authored-By: Claude Opus 5.5 <noreply@anthropic.com>
Claude-Session: https://claude.ai/code/session_013wZZbcd8JLzDSkyusgC2RL
</commit_message>
<xml_diff>
--- a/oevelsesvejledning-maanens-afstand.docx
+++ b/oevelsesvejledning-maanens-afstand.docx
@@ -99,6 +99,18 @@
         <w:t xml:space="preserve"> </w:t>
       </w:r>
       <w:r>
+        <w:t xml:space="preserve">del</w:t>
+      </w:r>
+      <w:r>
+        <w:t xml:space="preserve"> </w:t>
+      </w:r>
+      <w:r>
+        <w:t xml:space="preserve">1:</w:t>
+      </w:r>
+      <w:r>
+        <w:t xml:space="preserve"> </w:t>
+      </w:r>
+      <w:r>
         <w:t xml:space="preserve">Aristarchs</w:t>
       </w:r>
       <w:r>
@@ -141,7 +153,49 @@
         <w:t xml:space="preserve"> </w:t>
       </w:r>
       <w:r>
-        <w:t xml:space="preserve">måneformørkelse</w:t>
+        <w:t xml:space="preserve">måneformørkelse;</w:t>
+      </w:r>
+      <w:r>
+        <w:t xml:space="preserve"> </w:t>
+      </w:r>
+      <w:r>
+        <w:t xml:space="preserve">del</w:t>
+      </w:r>
+      <w:r>
+        <w:t xml:space="preserve"> </w:t>
+      </w:r>
+      <w:r>
+        <w:t xml:space="preserve">2:</w:t>
+      </w:r>
+      <w:r>
+        <w:t xml:space="preserve"> </w:t>
+      </w:r>
+      <w:r>
+        <w:t xml:space="preserve">pendul,</w:t>
+      </w:r>
+      <w:r>
+        <w:t xml:space="preserve"> </w:t>
+      </w:r>
+      <w:r>
+        <w:t xml:space="preserve">måned</w:t>
+      </w:r>
+      <w:r>
+        <w:t xml:space="preserve"> </w:t>
+      </w:r>
+      <w:r>
+        <w:t xml:space="preserve">og</w:t>
+      </w:r>
+      <w:r>
+        <w:t xml:space="preserve"> </w:t>
+      </w:r>
+      <w:r>
+        <w:t xml:space="preserve">Newtons</w:t>
+      </w:r>
+      <w:r>
+        <w:t xml:space="preserve"> </w:t>
+      </w:r>
+      <w:r>
+        <w:t xml:space="preserve">tyngdelov</w:t>
       </w:r>
     </w:p>
     <w:p>
@@ -200,10 +254,19 @@
         <w:t xml:space="preserve">mhgfysik.dk/maanens-afstand-formoerkelse.html</w:t>
       </w:r>
     </w:p>
+    <w:bookmarkStart w:id="40" w:name="del-1-jordens-skygge"/>
+    <w:p>
+      <w:pPr>
+        <w:pStyle w:val="Heading1"/>
+      </w:pPr>
+      <w:r>
+        <w:t xml:space="preserve">Del 1: Jordens skygge</w:t>
+      </w:r>
+    </w:p>
     <w:bookmarkStart w:id="20" w:name="formål"/>
     <w:p>
       <w:pPr>
-        <w:pStyle w:val="Heading1"/>
+        <w:pStyle w:val="Heading2"/>
       </w:pPr>
       <w:r>
         <w:t xml:space="preserve">Formål</w:t>
@@ -229,7 +292,7 @@
     <w:bookmarkStart w:id="28" w:name="baggrund"/>
     <w:p>
       <w:pPr>
-        <w:pStyle w:val="Heading1"/>
+        <w:pStyle w:val="Heading2"/>
       </w:pPr>
       <w:r>
         <w:t xml:space="preserve">Baggrund</w:t>
@@ -238,7 +301,7 @@
     <w:bookmarkStart w:id="24" w:name="skyggekeglen"/>
     <w:p>
       <w:pPr>
-        <w:pStyle w:val="Heading2"/>
+        <w:pStyle w:val="Heading3"/>
       </w:pPr>
       <w:r>
         <w:t xml:space="preserve">Skyggekeglen</w:t>
@@ -359,7 +422,7 @@
     <w:bookmarkStart w:id="25" w:name="vinklerne"/>
     <w:p>
       <w:pPr>
-        <w:pStyle w:val="Heading2"/>
+        <w:pStyle w:val="Heading3"/>
       </w:pPr>
       <w:r>
         <w:t xml:space="preserve">Vinklerne</w:t>
@@ -1262,7 +1325,7 @@
     <w:bookmarkStart w:id="26" w:name="aristarchs-genvej"/>
     <w:p>
       <w:pPr>
-        <w:pStyle w:val="Heading2"/>
+        <w:pStyle w:val="Heading3"/>
       </w:pPr>
       <w:r>
         <w:t xml:space="preserve">Aristarchs genvej</w:t>
@@ -1421,7 +1484,7 @@
     <w:bookmarkStart w:id="27" w:name="atmosfæren"/>
     <w:p>
       <w:pPr>
-        <w:pStyle w:val="Heading2"/>
+        <w:pStyle w:val="Heading3"/>
       </w:pPr>
       <w:r>
         <w:t xml:space="preserve">Atmosfæren</w:t>
@@ -1509,7 +1572,7 @@
     <w:bookmarkStart w:id="29" w:name="materialer"/>
     <w:p>
       <w:pPr>
-        <w:pStyle w:val="Heading1"/>
+        <w:pStyle w:val="Heading2"/>
       </w:pPr>
       <w:r>
         <w:t xml:space="preserve">Materialer</w:t>
@@ -1585,7 +1648,7 @@
     <w:bookmarkStart w:id="32" w:name="fremgangsmåde"/>
     <w:p>
       <w:pPr>
-        <w:pStyle w:val="Heading1"/>
+        <w:pStyle w:val="Heading2"/>
       </w:pPr>
       <w:r>
         <w:t xml:space="preserve">Fremgangsmåde</w:t>
@@ -1594,7 +1657,7 @@
     <w:bookmarkStart w:id="30" w:name="måling-af-k-i-geogebra"/>
     <w:p>
       <w:pPr>
-        <w:pStyle w:val="Heading2"/>
+        <w:pStyle w:val="Heading3"/>
       </w:pPr>
       <w:r>
         <w:t xml:space="preserve">Måling af k i GeoGebra</w:t>
@@ -1821,7 +1884,7 @@
     <w:bookmarkStart w:id="31" w:name="beregning"/>
     <w:p>
       <w:pPr>
-        <w:pStyle w:val="Heading2"/>
+        <w:pStyle w:val="Heading3"/>
       </w:pPr>
       <w:r>
         <w:t xml:space="preserve">Beregning</w:t>
@@ -2021,7 +2084,7 @@
     <w:bookmarkStart w:id="36" w:name="udregnet-eksempel"/>
     <w:p>
       <w:pPr>
-        <w:pStyle w:val="Heading1"/>
+        <w:pStyle w:val="Heading2"/>
       </w:pPr>
       <w:r>
         <w:t xml:space="preserve">Udregnet eksempel</w:t>
@@ -3015,7 +3078,7 @@
     <w:bookmarkStart w:id="37" w:name="fejlkilder"/>
     <w:p>
       <w:pPr>
-        <w:pStyle w:val="Heading1"/>
+        <w:pStyle w:val="Heading2"/>
       </w:pPr>
       <w:r>
         <w:t xml:space="preserve">Fejlkilder</w:t>
@@ -3183,7 +3246,7 @@
     <w:bookmarkStart w:id="38" w:name="spørgsmål"/>
     <w:p>
       <w:pPr>
-        <w:pStyle w:val="Heading1"/>
+        <w:pStyle w:val="Heading2"/>
       </w:pPr>
       <w:r>
         <w:t xml:space="preserve">Spørgsmål</w:t>
@@ -3389,7 +3452,7 @@
     <w:bookmarkStart w:id="39" w:name="X6b0a464ebbc6bc31b8a9f8d616ed6b40b95e130"/>
     <w:p>
       <w:pPr>
-        <w:pStyle w:val="Heading1"/>
+        <w:pStyle w:val="Heading2"/>
       </w:pPr>
       <w:r>
         <w:t xml:space="preserve">Ekstraopgave: Solens vinkelradius med et hulkamera</w:t>
@@ -3533,13 +3596,1802 @@
       </w:r>
     </w:p>
     <w:bookmarkEnd w:id="39"/>
-    <w:bookmarkStart w:id="40" w:name="lærervejledning-og-facit"/>
+    <w:bookmarkEnd w:id="40"/>
+    <w:bookmarkStart w:id="46" w:name="X3fc48ebc3e787dc1977a2fc2b780499d3621e18"/>
     <w:p>
       <w:pPr>
         <w:pStyle w:val="Heading1"/>
       </w:pPr>
       <w:r>
+        <w:t xml:space="preserve">Del 2: En anden vej — pendul, måned og Newton</w:t>
+      </w:r>
+    </w:p>
+    <w:p>
+      <w:pPr>
+        <w:pStyle w:val="FirstParagraph"/>
+      </w:pPr>
+      <w:r>
+        <w:t xml:space="preserve">Afstanden til Månen kan også findes helt uden formørkelse. I skal bruge tre ting: tyngdeaccelerationen</w:t>
+      </w:r>
+      <w:r>
+        <w:t xml:space="preserve"> </w:t>
+      </w:r>
+      <m:oMath>
+        <m:r>
+          <m:t>g</m:t>
+        </m:r>
+      </m:oMath>
+      <w:r>
+        <w:t xml:space="preserve">, som I måler selv, Jordens radius</w:t>
+      </w:r>
+      <w:r>
+        <w:t xml:space="preserve"> </w:t>
+      </w:r>
+      <m:oMath>
+        <m:r>
+          <m:t>R</m:t>
+        </m:r>
+      </m:oMath>
+      <w:r>
+        <w:t xml:space="preserve"> </w:t>
+      </w:r>
+      <w:r>
+        <w:t xml:space="preserve">og længden af en måned. Resten er Newtons tyngdelov.</w:t>
+      </w:r>
+    </w:p>
+    <w:bookmarkStart w:id="41" w:name="trin-1-mål-g-med-et-pendul"/>
+    <w:p>
+      <w:pPr>
+        <w:pStyle w:val="Heading2"/>
+      </w:pPr>
+      <w:r>
+        <w:t xml:space="preserve">Trin 1: Mål g med et pendul</w:t>
+      </w:r>
+    </w:p>
+    <w:p>
+      <w:pPr>
+        <w:pStyle w:val="FirstParagraph"/>
+      </w:pPr>
+      <w:r>
+        <w:t xml:space="preserve">Et pendul med længden</w:t>
+      </w:r>
+      <w:r>
+        <w:t xml:space="preserve"> </w:t>
+      </w:r>
+      <m:oMath>
+        <m:r>
+          <m:t>L</m:t>
+        </m:r>
+      </m:oMath>
+      <w:r>
+        <w:t xml:space="preserve"> </w:t>
+      </w:r>
+      <w:r>
+        <w:t xml:space="preserve">har ved små udsving svingningstiden</w:t>
+      </w:r>
+    </w:p>
+    <w:p>
+      <w:pPr>
+        <w:pStyle w:val="BodyText"/>
+      </w:pPr>
+      <m:oMathPara>
+        <m:oMathParaPr>
+          <m:jc m:val="center"/>
+        </m:oMathParaPr>
+        <m:oMath>
+          <m:sSub>
+            <m:e>
+              <m:r>
+                <m:t>T</m:t>
+              </m:r>
+            </m:e>
+            <m:sub>
+              <m:r>
+                <m:t>p</m:t>
+              </m:r>
+            </m:sub>
+          </m:sSub>
+          <m:r>
+            <m:rPr>
+              <m:sty m:val="p"/>
+            </m:rPr>
+            <m:t>=</m:t>
+          </m:r>
+          <m:r>
+            <m:t>2</m:t>
+          </m:r>
+          <m:r>
+            <m:t>π</m:t>
+          </m:r>
+          <m:rad>
+            <m:radPr>
+              <m:degHide m:val="on"/>
+            </m:radPr>
+            <m:deg/>
+            <m:e>
+              <m:f>
+                <m:fPr>
+                  <m:type m:val="bar"/>
+                </m:fPr>
+                <m:num>
+                  <m:r>
+                    <m:t>L</m:t>
+                  </m:r>
+                </m:num>
+                <m:den>
+                  <m:r>
+                    <m:t>g</m:t>
+                  </m:r>
+                </m:den>
+              </m:f>
+            </m:e>
+          </m:rad>
+          <m:r>
+            <m:t>  </m:t>
+          </m:r>
+          <m:r>
+            <m:rPr>
+              <m:sty m:val="p"/>
+            </m:rPr>
+            <m:t>⇒</m:t>
+          </m:r>
+          <m:r>
+            <m:t>  </m:t>
+          </m:r>
+          <m:r>
+            <m:t>g</m:t>
+          </m:r>
+          <m:r>
+            <m:rPr>
+              <m:sty m:val="p"/>
+            </m:rPr>
+            <m:t>=</m:t>
+          </m:r>
+          <m:f>
+            <m:fPr>
+              <m:type m:val="bar"/>
+            </m:fPr>
+            <m:num>
+              <m:r>
+                <m:t>4</m:t>
+              </m:r>
+              <m:sSup>
+                <m:e>
+                  <m:r>
+                    <m:t>π</m:t>
+                  </m:r>
+                </m:e>
+                <m:sup>
+                  <m:r>
+                    <m:t>2</m:t>
+                  </m:r>
+                </m:sup>
+              </m:sSup>
+              <m:r>
+                <m:t>L</m:t>
+              </m:r>
+            </m:num>
+            <m:den>
+              <m:sSubSup>
+                <m:e>
+                  <m:r>
+                    <m:t>T</m:t>
+                  </m:r>
+                </m:e>
+                <m:sub>
+                  <m:r>
+                    <m:t>p</m:t>
+                  </m:r>
+                </m:sub>
+                <m:sup>
+                  <m:r>
+                    <m:t> </m:t>
+                  </m:r>
+                  <m:r>
+                    <m:t>2</m:t>
+                  </m:r>
+                </m:sup>
+              </m:sSubSup>
+            </m:den>
+          </m:f>
+          <m:r>
+            <m:rPr>
+              <m:sty m:val="p"/>
+            </m:rPr>
+            <m:t>.</m:t>
+          </m:r>
+        </m:oMath>
+      </m:oMathPara>
+    </w:p>
+    <w:p>
+      <w:pPr>
+        <w:numPr>
+          <w:ilvl w:val="0"/>
+          <w:numId w:val="1006"/>
+        </w:numPr>
+        <w:pStyle w:val="Compact"/>
+      </w:pPr>
+      <w:r>
+        <w:t xml:space="preserve">Hæng et tungt lod i en tynd snor, mindst 1 m lang. Mål</w:t>
+      </w:r>
+      <w:r>
+        <w:t xml:space="preserve"> </w:t>
+      </w:r>
+      <m:oMath>
+        <m:r>
+          <m:t>L</m:t>
+        </m:r>
+      </m:oMath>
+      <w:r>
+        <w:t xml:space="preserve"> </w:t>
+      </w:r>
+      <w:r>
+        <w:t xml:space="preserve">fra ophænget til loddets tyngdepunkt.</w:t>
+      </w:r>
+    </w:p>
+    <w:p>
+      <w:pPr>
+        <w:numPr>
+          <w:ilvl w:val="0"/>
+          <w:numId w:val="1006"/>
+        </w:numPr>
+        <w:pStyle w:val="Compact"/>
+      </w:pPr>
+      <w:r>
+        <w:t xml:space="preserve">Giv loddet et lille udsving, under ca. 10°.</w:t>
+      </w:r>
+    </w:p>
+    <w:p>
+      <w:pPr>
+        <w:numPr>
+          <w:ilvl w:val="0"/>
+          <w:numId w:val="1006"/>
+        </w:numPr>
+        <w:pStyle w:val="Compact"/>
+      </w:pPr>
+      <w:r>
+        <w:t xml:space="preserve">Tag tiden for 20 hele svingninger, og del med 20. Gentag tre gange.</w:t>
+      </w:r>
+    </w:p>
+    <w:p>
+      <w:pPr>
+        <w:numPr>
+          <w:ilvl w:val="0"/>
+          <w:numId w:val="1006"/>
+        </w:numPr>
+        <w:pStyle w:val="Compact"/>
+      </w:pPr>
+      <w:r>
+        <w:t xml:space="preserve">Beregn</w:t>
+      </w:r>
+      <w:r>
+        <w:t xml:space="preserve"> </w:t>
+      </w:r>
+      <m:oMath>
+        <m:r>
+          <m:t>g</m:t>
+        </m:r>
+      </m:oMath>
+      <w:r>
+        <w:t xml:space="preserve">.</w:t>
+      </w:r>
+    </w:p>
+    <w:p>
+      <w:pPr>
+        <w:pStyle w:val="FirstParagraph"/>
+      </w:pPr>
+      <w:r>
+        <w:rPr>
+          <w:bCs/>
+          <w:b/>
+        </w:rPr>
+        <w:t xml:space="preserve">Pas på cirkelslutninger.</w:t>
+      </w:r>
+      <w:r>
+        <w:t xml:space="preserve"> </w:t>
+      </w:r>
+      <w:r>
+        <w:t xml:space="preserve">Brug en metode, der ikke selv forudsætter</w:t>
+      </w:r>
+      <w:r>
+        <w:t xml:space="preserve"> </w:t>
+      </w:r>
+      <m:oMath>
+        <m:r>
+          <m:t>g</m:t>
+        </m:r>
+      </m:oMath>
+      <w:r>
+        <w:t xml:space="preserve">, fx pendulet eller frit fald. En metode, hvor man kalibrerer med lodder af forskellig masse på en kraftmåler eller vægt, bygger på, at vægten er</w:t>
+      </w:r>
+      <w:r>
+        <w:t xml:space="preserve"> </w:t>
+      </w:r>
+      <m:oMath>
+        <m:r>
+          <m:t>m</m:t>
+        </m:r>
+        <m:r>
+          <m:rPr>
+            <m:sty m:val="p"/>
+          </m:rPr>
+          <m:t>⋅</m:t>
+        </m:r>
+        <m:r>
+          <m:t>g</m:t>
+        </m:r>
+      </m:oMath>
+      <w:r>
+        <w:t xml:space="preserve">. Den forudsætter altså det, man vil måle, og må ikke bruges her.</w:t>
+      </w:r>
+    </w:p>
+    <w:bookmarkEnd w:id="41"/>
+    <w:bookmarkStart w:id="42" w:name="trin-2-fra-g-til-jordens-masse"/>
+    <w:p>
+      <w:pPr>
+        <w:pStyle w:val="Heading2"/>
+      </w:pPr>
+      <w:r>
+        <w:t xml:space="preserve">Trin 2: Fra g til Jordens masse</w:t>
+      </w:r>
+    </w:p>
+    <w:p>
+      <w:pPr>
+        <w:pStyle w:val="FirstParagraph"/>
+      </w:pPr>
+      <w:r>
+        <w:t xml:space="preserve">Ved Jordens overflade er tyngdekraften på en genstand med massen</w:t>
+      </w:r>
+      <w:r>
+        <w:t xml:space="preserve"> </w:t>
+      </w:r>
+      <m:oMath>
+        <m:r>
+          <m:t>m</m:t>
+        </m:r>
+      </m:oMath>
+      <w:r>
+        <w:t xml:space="preserve"> </w:t>
+      </w:r>
+      <w:r>
+        <w:t xml:space="preserve">givet ved Newtons tyngdelov:</w:t>
+      </w:r>
+    </w:p>
+    <w:p>
+      <w:pPr>
+        <w:pStyle w:val="BodyText"/>
+      </w:pPr>
+      <m:oMathPara>
+        <m:oMathParaPr>
+          <m:jc m:val="center"/>
+        </m:oMathParaPr>
+        <m:oMath>
+          <m:r>
+            <m:t>m</m:t>
+          </m:r>
+          <m:r>
+            <m:t> </m:t>
+          </m:r>
+          <m:r>
+            <m:t>g</m:t>
+          </m:r>
+          <m:r>
+            <m:rPr>
+              <m:sty m:val="p"/>
+            </m:rPr>
+            <m:t>=</m:t>
+          </m:r>
+          <m:f>
+            <m:fPr>
+              <m:type m:val="bar"/>
+            </m:fPr>
+            <m:num>
+              <m:r>
+                <m:t>G</m:t>
+              </m:r>
+              <m:r>
+                <m:t> </m:t>
+              </m:r>
+              <m:r>
+                <m:t>M</m:t>
+              </m:r>
+              <m:r>
+                <m:t> </m:t>
+              </m:r>
+              <m:r>
+                <m:t>m</m:t>
+              </m:r>
+            </m:num>
+            <m:den>
+              <m:sSup>
+                <m:e>
+                  <m:r>
+                    <m:t>R</m:t>
+                  </m:r>
+                </m:e>
+                <m:sup>
+                  <m:r>
+                    <m:t>2</m:t>
+                  </m:r>
+                </m:sup>
+              </m:sSup>
+            </m:den>
+          </m:f>
+          <m:r>
+            <m:t>  </m:t>
+          </m:r>
+          <m:r>
+            <m:rPr>
+              <m:sty m:val="p"/>
+            </m:rPr>
+            <m:t>⇒</m:t>
+          </m:r>
+          <m:r>
+            <m:t>  </m:t>
+          </m:r>
+          <m:r>
+            <m:t>G</m:t>
+          </m:r>
+          <m:r>
+            <m:t> </m:t>
+          </m:r>
+          <m:r>
+            <m:t>M</m:t>
+          </m:r>
+          <m:r>
+            <m:rPr>
+              <m:sty m:val="p"/>
+            </m:rPr>
+            <m:t>=</m:t>
+          </m:r>
+          <m:r>
+            <m:t>g</m:t>
+          </m:r>
+          <m:r>
+            <m:t> </m:t>
+          </m:r>
+          <m:sSup>
+            <m:e>
+              <m:r>
+                <m:t>R</m:t>
+              </m:r>
+            </m:e>
+            <m:sup>
+              <m:r>
+                <m:t>2</m:t>
+              </m:r>
+            </m:sup>
+          </m:sSup>
+          <m:r>
+            <m:rPr>
+              <m:sty m:val="p"/>
+            </m:rPr>
+            <m:t>.</m:t>
+          </m:r>
+        </m:oMath>
+      </m:oMathPara>
+    </w:p>
+    <w:p>
+      <w:pPr>
+        <w:pStyle w:val="FirstParagraph"/>
+      </w:pPr>
+      <w:r>
+        <w:t xml:space="preserve">I behøver hverken</w:t>
+      </w:r>
+      <w:r>
+        <w:t xml:space="preserve"> </w:t>
+      </w:r>
+      <m:oMath>
+        <m:r>
+          <m:t>G</m:t>
+        </m:r>
+      </m:oMath>
+      <w:r>
+        <w:t xml:space="preserve"> </w:t>
+      </w:r>
+      <w:r>
+        <w:t xml:space="preserve">eller Jordens masse</w:t>
+      </w:r>
+      <w:r>
+        <w:t xml:space="preserve"> </w:t>
+      </w:r>
+      <m:oMath>
+        <m:r>
+          <m:t>M</m:t>
+        </m:r>
+      </m:oMath>
+      <w:r>
+        <w:t xml:space="preserve"> </w:t>
+      </w:r>
+      <w:r>
+        <w:t xml:space="preserve">hver for sig, kun produktet</w:t>
+      </w:r>
+      <w:r>
+        <w:t xml:space="preserve"> </w:t>
+      </w:r>
+      <m:oMath>
+        <m:r>
+          <m:t>G</m:t>
+        </m:r>
+        <m:r>
+          <m:t>M</m:t>
+        </m:r>
+      </m:oMath>
+      <w:r>
+        <w:t xml:space="preserve">. Jordens radius er</w:t>
+      </w:r>
+      <w:r>
+        <w:t xml:space="preserve"> </w:t>
+      </w:r>
+      <m:oMath>
+        <m:r>
+          <m:t>R</m:t>
+        </m:r>
+        <m:r>
+          <m:rPr>
+            <m:sty m:val="p"/>
+          </m:rPr>
+          <m:t>=</m:t>
+        </m:r>
+        <m:r>
+          <m:t>6371</m:t>
+        </m:r>
+      </m:oMath>
+      <w:r>
+        <w:t xml:space="preserve"> </w:t>
+      </w:r>
+      <w:r>
+        <w:t xml:space="preserve">km. Den kan også måles, som Eratosthenes gjorde.</w:t>
+      </w:r>
+    </w:p>
+    <w:bookmarkEnd w:id="42"/>
+    <w:bookmarkStart w:id="43" w:name="trin-3-månen-falder-om-jorden"/>
+    <w:p>
+      <w:pPr>
+        <w:pStyle w:val="Heading2"/>
+      </w:pPr>
+      <w:r>
+        <w:t xml:space="preserve">Trin 3: Månen falder om Jorden</w:t>
+      </w:r>
+    </w:p>
+    <w:p>
+      <w:pPr>
+        <w:pStyle w:val="FirstParagraph"/>
+      </w:pPr>
+      <w:r>
+        <w:t xml:space="preserve">Den samme tyngdekraft holder Månen i sin bane. Antag, at banen er en cirkel med radius</w:t>
+      </w:r>
+      <w:r>
+        <w:t xml:space="preserve"> </w:t>
+      </w:r>
+      <m:oMath>
+        <m:r>
+          <m:t>D</m:t>
+        </m:r>
+      </m:oMath>
+      <w:r>
+        <w:t xml:space="preserve"> </w:t>
+      </w:r>
+      <w:r>
+        <w:t xml:space="preserve">og omløbstid</w:t>
+      </w:r>
+      <w:r>
+        <w:t xml:space="preserve"> </w:t>
+      </w:r>
+      <m:oMath>
+        <m:r>
+          <m:t>T</m:t>
+        </m:r>
+      </m:oMath>
+      <w:r>
+        <w:t xml:space="preserve">. Så er tyngdekraften netop den centripetalkraft, der skal til:</w:t>
+      </w:r>
+    </w:p>
+    <w:p>
+      <w:pPr>
+        <w:pStyle w:val="BodyText"/>
+      </w:pPr>
+      <m:oMathPara>
+        <m:oMathParaPr>
+          <m:jc m:val="center"/>
+        </m:oMathParaPr>
+        <m:oMath>
+          <m:f>
+            <m:fPr>
+              <m:type m:val="bar"/>
+            </m:fPr>
+            <m:num>
+              <m:r>
+                <m:t>G</m:t>
+              </m:r>
+              <m:r>
+                <m:t> </m:t>
+              </m:r>
+              <m:r>
+                <m:t>M</m:t>
+              </m:r>
+            </m:num>
+            <m:den>
+              <m:sSup>
+                <m:e>
+                  <m:r>
+                    <m:t>D</m:t>
+                  </m:r>
+                </m:e>
+                <m:sup>
+                  <m:r>
+                    <m:t>2</m:t>
+                  </m:r>
+                </m:sup>
+              </m:sSup>
+            </m:den>
+          </m:f>
+          <m:r>
+            <m:rPr>
+              <m:sty m:val="p"/>
+            </m:rPr>
+            <m:t>=</m:t>
+          </m:r>
+          <m:f>
+            <m:fPr>
+              <m:type m:val="bar"/>
+            </m:fPr>
+            <m:num>
+              <m:r>
+                <m:t>4</m:t>
+              </m:r>
+              <m:sSup>
+                <m:e>
+                  <m:r>
+                    <m:t>π</m:t>
+                  </m:r>
+                </m:e>
+                <m:sup>
+                  <m:r>
+                    <m:t>2</m:t>
+                  </m:r>
+                </m:sup>
+              </m:sSup>
+              <m:r>
+                <m:t>D</m:t>
+              </m:r>
+            </m:num>
+            <m:den>
+              <m:sSup>
+                <m:e>
+                  <m:r>
+                    <m:t>T</m:t>
+                  </m:r>
+                </m:e>
+                <m:sup>
+                  <m:r>
+                    <m:t>2</m:t>
+                  </m:r>
+                </m:sup>
+              </m:sSup>
+            </m:den>
+          </m:f>
+          <m:r>
+            <m:t>  </m:t>
+          </m:r>
+          <m:r>
+            <m:rPr>
+              <m:sty m:val="p"/>
+            </m:rPr>
+            <m:t>⇒</m:t>
+          </m:r>
+          <m:r>
+            <m:t>  </m:t>
+          </m:r>
+          <m:r>
+            <m:t>D</m:t>
+          </m:r>
+          <m:r>
+            <m:rPr>
+              <m:sty m:val="p"/>
+            </m:rPr>
+            <m:t>=</m:t>
+          </m:r>
+          <m:sSup>
+            <m:e>
+              <m:d>
+                <m:dPr>
+                  <m:begChr m:val="("/>
+                  <m:endChr m:val=")"/>
+                  <m:sepChr m:val=""/>
+                  <m:grow/>
+                </m:dPr>
+                <m:e>
+                  <m:f>
+                    <m:fPr>
+                      <m:type m:val="bar"/>
+                    </m:fPr>
+                    <m:num>
+                      <m:r>
+                        <m:t>g</m:t>
+                      </m:r>
+                      <m:r>
+                        <m:t> </m:t>
+                      </m:r>
+                      <m:sSup>
+                        <m:e>
+                          <m:r>
+                            <m:t>R</m:t>
+                          </m:r>
+                        </m:e>
+                        <m:sup>
+                          <m:r>
+                            <m:t>2</m:t>
+                          </m:r>
+                        </m:sup>
+                      </m:sSup>
+                      <m:r>
+                        <m:t> </m:t>
+                      </m:r>
+                      <m:sSup>
+                        <m:e>
+                          <m:r>
+                            <m:t>T</m:t>
+                          </m:r>
+                        </m:e>
+                        <m:sup>
+                          <m:r>
+                            <m:t>2</m:t>
+                          </m:r>
+                        </m:sup>
+                      </m:sSup>
+                    </m:num>
+                    <m:den>
+                      <m:r>
+                        <m:t>4</m:t>
+                      </m:r>
+                      <m:sSup>
+                        <m:e>
+                          <m:r>
+                            <m:t>π</m:t>
+                          </m:r>
+                        </m:e>
+                        <m:sup>
+                          <m:r>
+                            <m:t>2</m:t>
+                          </m:r>
+                        </m:sup>
+                      </m:sSup>
+                    </m:den>
+                  </m:f>
+                </m:e>
+              </m:d>
+            </m:e>
+            <m:sup>
+              <m:r>
+                <m:t>1</m:t>
+              </m:r>
+              <m:r>
+                <m:rPr>
+                  <m:sty m:val="p"/>
+                </m:rPr>
+                <m:t>/</m:t>
+              </m:r>
+              <m:r>
+                <m:t>3</m:t>
+              </m:r>
+            </m:sup>
+          </m:sSup>
+          <m:r>
+            <m:rPr>
+              <m:sty m:val="p"/>
+            </m:rPr>
+            <m:t>.</m:t>
+          </m:r>
+        </m:oMath>
+      </m:oMathPara>
+    </w:p>
+    <w:p>
+      <w:pPr>
+        <w:pStyle w:val="FirstParagraph"/>
+      </w:pPr>
+      <w:r>
+        <w:t xml:space="preserve">Det er Keplers 3. lov for Månen.</w:t>
+      </w:r>
+      <w:r>
+        <w:t xml:space="preserve"> </w:t>
+      </w:r>
+      <w:r>
+        <w:rPr>
+          <w:bCs/>
+          <w:b/>
+        </w:rPr>
+        <w:t xml:space="preserve">Brug den sideriske måned</w:t>
+      </w:r>
+      <w:r>
+        <w:t xml:space="preserve">,</w:t>
+      </w:r>
+      <w:r>
+        <w:t xml:space="preserve"> </w:t>
+      </w:r>
+      <m:oMath>
+        <m:r>
+          <m:t>T</m:t>
+        </m:r>
+        <m:r>
+          <m:rPr>
+            <m:sty m:val="p"/>
+          </m:rPr>
+          <m:t>=</m:t>
+        </m:r>
+        <m:r>
+          <m:t>27</m:t>
+        </m:r>
+        <m:r>
+          <m:rPr>
+            <m:sty m:val="p"/>
+          </m:rPr>
+          <m:t>,</m:t>
+        </m:r>
+        <m:r>
+          <m:t>32</m:t>
+        </m:r>
+      </m:oMath>
+      <w:r>
+        <w:t xml:space="preserve"> </w:t>
+      </w:r>
+      <w:r>
+        <w:t xml:space="preserve">døgn: den tid, Månen er om at komme rundt i forhold til stjernerne.</w:t>
+      </w:r>
+    </w:p>
+    <w:bookmarkEnd w:id="43"/>
+    <w:bookmarkStart w:id="44" w:name="udregnet-eksempel-1"/>
+    <w:p>
+      <w:pPr>
+        <w:pStyle w:val="Heading2"/>
+      </w:pPr>
+      <w:r>
+        <w:t xml:space="preserve">Udregnet eksempel</w:t>
+      </w:r>
+    </w:p>
+    <w:p>
+      <w:pPr>
+        <w:pStyle w:val="FirstParagraph"/>
+      </w:pPr>
+      <w:r>
+        <w:rPr>
+          <w:bCs/>
+          <w:b/>
+        </w:rPr>
+        <w:t xml:space="preserve">Pendulet:</w:t>
+      </w:r>
+      <w:r>
+        <w:t xml:space="preserve"> </w:t>
+      </w:r>
+      <m:oMath>
+        <m:r>
+          <m:t>L</m:t>
+        </m:r>
+        <m:r>
+          <m:rPr>
+            <m:sty m:val="p"/>
+          </m:rPr>
+          <m:t>=</m:t>
+        </m:r>
+        <m:r>
+          <m:t>1</m:t>
+        </m:r>
+        <m:r>
+          <m:rPr>
+            <m:sty m:val="p"/>
+          </m:rPr>
+          <m:t>,</m:t>
+        </m:r>
+        <m:r>
+          <m:t>000</m:t>
+        </m:r>
+      </m:oMath>
+      <w:r>
+        <w:t xml:space="preserve"> </w:t>
+      </w:r>
+      <w:r>
+        <w:t xml:space="preserve">m. 20 svingninger tog 40,12 s, så</w:t>
+      </w:r>
+      <w:r>
+        <w:t xml:space="preserve"> </w:t>
+      </w:r>
+      <m:oMath>
+        <m:sSub>
+          <m:e>
+            <m:r>
+              <m:t>T</m:t>
+            </m:r>
+          </m:e>
+          <m:sub>
+            <m:r>
+              <m:t>p</m:t>
+            </m:r>
+          </m:sub>
+        </m:sSub>
+        <m:r>
+          <m:rPr>
+            <m:sty m:val="p"/>
+          </m:rPr>
+          <m:t>=</m:t>
+        </m:r>
+        <m:r>
+          <m:t>2</m:t>
+        </m:r>
+        <m:r>
+          <m:rPr>
+            <m:sty m:val="p"/>
+          </m:rPr>
+          <m:t>,</m:t>
+        </m:r>
+        <m:r>
+          <m:t>006</m:t>
+        </m:r>
+      </m:oMath>
+      <w:r>
+        <w:t xml:space="preserve"> </w:t>
+      </w:r>
+      <w:r>
+        <w:t xml:space="preserve">s og</w:t>
+      </w:r>
+    </w:p>
+    <w:p>
+      <w:pPr>
+        <w:pStyle w:val="BodyText"/>
+      </w:pPr>
+      <m:oMathPara>
+        <m:oMathParaPr>
+          <m:jc m:val="center"/>
+        </m:oMathParaPr>
+        <m:oMath>
+          <m:r>
+            <m:t>g</m:t>
+          </m:r>
+          <m:r>
+            <m:rPr>
+              <m:sty m:val="p"/>
+            </m:rPr>
+            <m:t>=</m:t>
+          </m:r>
+          <m:f>
+            <m:fPr>
+              <m:type m:val="bar"/>
+            </m:fPr>
+            <m:num>
+              <m:r>
+                <m:t>4</m:t>
+              </m:r>
+              <m:sSup>
+                <m:e>
+                  <m:r>
+                    <m:t>π</m:t>
+                  </m:r>
+                </m:e>
+                <m:sup>
+                  <m:r>
+                    <m:t>2</m:t>
+                  </m:r>
+                </m:sup>
+              </m:sSup>
+              <m:r>
+                <m:rPr>
+                  <m:sty m:val="p"/>
+                </m:rPr>
+                <m:t>⋅</m:t>
+              </m:r>
+              <m:r>
+                <m:t>1</m:t>
+              </m:r>
+              <m:r>
+                <m:rPr>
+                  <m:sty m:val="p"/>
+                </m:rPr>
+                <m:t>,</m:t>
+              </m:r>
+              <m:r>
+                <m:t>000</m:t>
+              </m:r>
+              <m:r>
+                <m:rPr>
+                  <m:nor/>
+                  <m:sty m:val="p"/>
+                </m:rPr>
+                <m:t> m</m:t>
+              </m:r>
+            </m:num>
+            <m:den>
+              <m:sSup>
+                <m:e>
+                  <m:d>
+                    <m:dPr>
+                      <m:begChr m:val="("/>
+                      <m:endChr m:val=")"/>
+                      <m:sepChr m:val=""/>
+                      <m:grow/>
+                    </m:dPr>
+                    <m:e>
+                      <m:r>
+                        <m:t>2</m:t>
+                      </m:r>
+                      <m:r>
+                        <m:rPr>
+                          <m:sty m:val="p"/>
+                        </m:rPr>
+                        <m:t>,</m:t>
+                      </m:r>
+                      <m:r>
+                        <m:t>006</m:t>
+                      </m:r>
+                      <m:r>
+                        <m:rPr>
+                          <m:nor/>
+                          <m:sty m:val="p"/>
+                        </m:rPr>
+                        <m:t> s</m:t>
+                      </m:r>
+                    </m:e>
+                  </m:d>
+                </m:e>
+                <m:sup>
+                  <m:r>
+                    <m:t>2</m:t>
+                  </m:r>
+                </m:sup>
+              </m:sSup>
+            </m:den>
+          </m:f>
+          <m:r>
+            <m:rPr>
+              <m:sty m:val="p"/>
+            </m:rPr>
+            <m:t>=</m:t>
+          </m:r>
+          <m:r>
+            <m:t>9</m:t>
+          </m:r>
+          <m:r>
+            <m:rPr>
+              <m:sty m:val="p"/>
+            </m:rPr>
+            <m:t>,</m:t>
+          </m:r>
+          <m:r>
+            <m:t>81</m:t>
+          </m:r>
+          <m:r>
+            <m:t> </m:t>
+          </m:r>
+          <m:r>
+            <m:rPr>
+              <m:sty m:val="p"/>
+            </m:rPr>
+            <m:t>m</m:t>
+          </m:r>
+          <m:r>
+            <m:rPr>
+              <m:sty m:val="p"/>
+            </m:rPr>
+            <m:t>/</m:t>
+          </m:r>
+          <m:sSup>
+            <m:e>
+              <m:r>
+                <m:rPr>
+                  <m:sty m:val="p"/>
+                </m:rPr>
+                <m:t>s</m:t>
+              </m:r>
+            </m:e>
+            <m:sup>
+              <m:r>
+                <m:rPr>
+                  <m:sty m:val="p"/>
+                </m:rPr>
+                <m:t>2</m:t>
+              </m:r>
+            </m:sup>
+          </m:sSup>
+          <m:r>
+            <m:rPr>
+              <m:sty m:val="p"/>
+            </m:rPr>
+            <m:t>.</m:t>
+          </m:r>
+        </m:oMath>
+      </m:oMathPara>
+    </w:p>
+    <w:p>
+      <w:pPr>
+        <w:pStyle w:val="FirstParagraph"/>
+      </w:pPr>
+      <w:r>
+        <w:rPr>
+          <w:bCs/>
+          <w:b/>
+        </w:rPr>
+        <w:t xml:space="preserve">Jordens masse:</w:t>
+      </w:r>
+      <w:r>
+        <w:t xml:space="preserve"> </w:t>
+      </w:r>
+      <m:oMath>
+        <m:r>
+          <m:t>G</m:t>
+        </m:r>
+        <m:r>
+          <m:t>M</m:t>
+        </m:r>
+        <m:r>
+          <m:rPr>
+            <m:sty m:val="p"/>
+          </m:rPr>
+          <m:t>=</m:t>
+        </m:r>
+        <m:r>
+          <m:t>9</m:t>
+        </m:r>
+        <m:r>
+          <m:rPr>
+            <m:sty m:val="p"/>
+          </m:rPr>
+          <m:t>,</m:t>
+        </m:r>
+        <m:r>
+          <m:t>81</m:t>
+        </m:r>
+        <m:r>
+          <m:t> </m:t>
+        </m:r>
+        <m:r>
+          <m:rPr>
+            <m:sty m:val="p"/>
+          </m:rPr>
+          <m:t>m</m:t>
+        </m:r>
+        <m:r>
+          <m:rPr>
+            <m:sty m:val="p"/>
+          </m:rPr>
+          <m:t>/</m:t>
+        </m:r>
+        <m:sSup>
+          <m:e>
+            <m:r>
+              <m:rPr>
+                <m:sty m:val="p"/>
+              </m:rPr>
+              <m:t>s</m:t>
+            </m:r>
+          </m:e>
+          <m:sup>
+            <m:r>
+              <m:rPr>
+                <m:sty m:val="p"/>
+              </m:rPr>
+              <m:t>2</m:t>
+            </m:r>
+          </m:sup>
+        </m:sSup>
+        <m:r>
+          <m:rPr>
+            <m:sty m:val="p"/>
+          </m:rPr>
+          <m:t>⋅</m:t>
+        </m:r>
+        <m:sSup>
+          <m:e>
+            <m:d>
+              <m:dPr>
+                <m:begChr m:val="("/>
+                <m:endChr m:val=")"/>
+                <m:sepChr m:val=""/>
+                <m:grow/>
+              </m:dPr>
+              <m:e>
+                <m:r>
+                  <m:t>6</m:t>
+                </m:r>
+                <m:r>
+                  <m:rPr>
+                    <m:sty m:val="p"/>
+                  </m:rPr>
+                  <m:t>,</m:t>
+                </m:r>
+                <m:r>
+                  <m:t>371</m:t>
+                </m:r>
+                <m:r>
+                  <m:rPr>
+                    <m:sty m:val="p"/>
+                  </m:rPr>
+                  <m:t>⋅</m:t>
+                </m:r>
+                <m:sSup>
+                  <m:e>
+                    <m:r>
+                      <m:t>10</m:t>
+                    </m:r>
+                  </m:e>
+                  <m:sup>
+                    <m:r>
+                      <m:t>6</m:t>
+                    </m:r>
+                  </m:sup>
+                </m:sSup>
+                <m:r>
+                  <m:rPr>
+                    <m:nor/>
+                    <m:sty m:val="p"/>
+                  </m:rPr>
+                  <m:t> m</m:t>
+                </m:r>
+              </m:e>
+            </m:d>
+          </m:e>
+          <m:sup>
+            <m:r>
+              <m:t>2</m:t>
+            </m:r>
+          </m:sup>
+        </m:sSup>
+        <m:r>
+          <m:rPr>
+            <m:sty m:val="p"/>
+          </m:rPr>
+          <m:t>=</m:t>
+        </m:r>
+        <m:r>
+          <m:t>3</m:t>
+        </m:r>
+        <m:r>
+          <m:rPr>
+            <m:sty m:val="p"/>
+          </m:rPr>
+          <m:t>,</m:t>
+        </m:r>
+        <m:r>
+          <m:t>98</m:t>
+        </m:r>
+        <m:r>
+          <m:rPr>
+            <m:sty m:val="p"/>
+          </m:rPr>
+          <m:t>⋅</m:t>
+        </m:r>
+        <m:sSup>
+          <m:e>
+            <m:r>
+              <m:t>10</m:t>
+            </m:r>
+          </m:e>
+          <m:sup>
+            <m:r>
+              <m:t>14</m:t>
+            </m:r>
+          </m:sup>
+        </m:sSup>
+        <m:r>
+          <m:t> </m:t>
+        </m:r>
+        <m:sSup>
+          <m:e>
+            <m:r>
+              <m:rPr>
+                <m:sty m:val="p"/>
+              </m:rPr>
+              <m:t>m</m:t>
+            </m:r>
+          </m:e>
+          <m:sup>
+            <m:r>
+              <m:rPr>
+                <m:sty m:val="p"/>
+              </m:rPr>
+              <m:t>3</m:t>
+            </m:r>
+          </m:sup>
+        </m:sSup>
+        <m:r>
+          <m:rPr>
+            <m:sty m:val="p"/>
+          </m:rPr>
+          <m:t>/</m:t>
+        </m:r>
+        <m:sSup>
+          <m:e>
+            <m:r>
+              <m:rPr>
+                <m:sty m:val="p"/>
+              </m:rPr>
+              <m:t>s</m:t>
+            </m:r>
+          </m:e>
+          <m:sup>
+            <m:r>
+              <m:rPr>
+                <m:sty m:val="p"/>
+              </m:rPr>
+              <m:t>2</m:t>
+            </m:r>
+          </m:sup>
+        </m:sSup>
+      </m:oMath>
+      <w:r>
+        <w:t xml:space="preserve">.</w:t>
+      </w:r>
+    </w:p>
+    <w:p>
+      <w:pPr>
+        <w:pStyle w:val="BodyText"/>
+      </w:pPr>
+      <w:r>
+        <w:rPr>
+          <w:bCs/>
+          <w:b/>
+        </w:rPr>
+        <w:t xml:space="preserve">Månens afstand:</w:t>
+      </w:r>
+      <w:r>
+        <w:t xml:space="preserve"> </w:t>
+      </w:r>
+      <m:oMath>
+        <m:r>
+          <m:t>T</m:t>
+        </m:r>
+        <m:r>
+          <m:rPr>
+            <m:sty m:val="p"/>
+          </m:rPr>
+          <m:t>=</m:t>
+        </m:r>
+        <m:r>
+          <m:t>27</m:t>
+        </m:r>
+        <m:r>
+          <m:rPr>
+            <m:sty m:val="p"/>
+          </m:rPr>
+          <m:t>,</m:t>
+        </m:r>
+        <m:r>
+          <m:t>32</m:t>
+        </m:r>
+      </m:oMath>
+      <w:r>
+        <w:t xml:space="preserve"> </w:t>
+      </w:r>
+      <w:r>
+        <w:t xml:space="preserve">døgn</w:t>
+      </w:r>
+      <w:r>
+        <w:t xml:space="preserve"> </w:t>
+      </w:r>
+      <m:oMath>
+        <m:r>
+          <m:rPr>
+            <m:sty m:val="p"/>
+          </m:rPr>
+          <m:t>=</m:t>
+        </m:r>
+        <m:r>
+          <m:t>2</m:t>
+        </m:r>
+        <m:r>
+          <m:rPr>
+            <m:sty m:val="p"/>
+          </m:rPr>
+          <m:t>,</m:t>
+        </m:r>
+        <m:r>
+          <m:t>360</m:t>
+        </m:r>
+        <m:r>
+          <m:rPr>
+            <m:sty m:val="p"/>
+          </m:rPr>
+          <m:t>⋅</m:t>
+        </m:r>
+        <m:sSup>
+          <m:e>
+            <m:r>
+              <m:t>10</m:t>
+            </m:r>
+          </m:e>
+          <m:sup>
+            <m:r>
+              <m:t>6</m:t>
+            </m:r>
+          </m:sup>
+        </m:sSup>
+      </m:oMath>
+      <w:r>
+        <w:t xml:space="preserve"> </w:t>
+      </w:r>
+      <w:r>
+        <w:t xml:space="preserve">s, så</w:t>
+      </w:r>
+    </w:p>
+    <w:p>
+      <w:pPr>
+        <w:pStyle w:val="BodyText"/>
+      </w:pPr>
+      <m:oMathPara>
+        <m:oMathParaPr>
+          <m:jc m:val="center"/>
+        </m:oMathParaPr>
+        <m:oMath>
+          <m:r>
+            <m:t>D</m:t>
+          </m:r>
+          <m:r>
+            <m:rPr>
+              <m:sty m:val="p"/>
+            </m:rPr>
+            <m:t>=</m:t>
+          </m:r>
+          <m:sSup>
+            <m:e>
+              <m:d>
+                <m:dPr>
+                  <m:begChr m:val="("/>
+                  <m:endChr m:val=")"/>
+                  <m:sepChr m:val=""/>
+                  <m:grow/>
+                </m:dPr>
+                <m:e>
+                  <m:f>
+                    <m:fPr>
+                      <m:type m:val="bar"/>
+                    </m:fPr>
+                    <m:num>
+                      <m:r>
+                        <m:t>3</m:t>
+                      </m:r>
+                      <m:r>
+                        <m:rPr>
+                          <m:sty m:val="p"/>
+                        </m:rPr>
+                        <m:t>,</m:t>
+                      </m:r>
+                      <m:r>
+                        <m:t>98</m:t>
+                      </m:r>
+                      <m:r>
+                        <m:rPr>
+                          <m:sty m:val="p"/>
+                        </m:rPr>
+                        <m:t>⋅</m:t>
+                      </m:r>
+                      <m:sSup>
+                        <m:e>
+                          <m:r>
+                            <m:t>10</m:t>
+                          </m:r>
+                        </m:e>
+                        <m:sup>
+                          <m:r>
+                            <m:t>14</m:t>
+                          </m:r>
+                        </m:sup>
+                      </m:sSup>
+                      <m:r>
+                        <m:rPr>
+                          <m:sty m:val="p"/>
+                        </m:rPr>
+                        <m:t>⋅</m:t>
+                      </m:r>
+                      <m:sSup>
+                        <m:e>
+                          <m:d>
+                            <m:dPr>
+                              <m:begChr m:val="("/>
+                              <m:endChr m:val=")"/>
+                              <m:sepChr m:val=""/>
+                              <m:grow/>
+                            </m:dPr>
+                            <m:e>
+                              <m:r>
+                                <m:t>2</m:t>
+                              </m:r>
+                              <m:r>
+                                <m:rPr>
+                                  <m:sty m:val="p"/>
+                                </m:rPr>
+                                <m:t>,</m:t>
+                              </m:r>
+                              <m:r>
+                                <m:t>360</m:t>
+                              </m:r>
+                              <m:r>
+                                <m:rPr>
+                                  <m:sty m:val="p"/>
+                                </m:rPr>
+                                <m:t>⋅</m:t>
+                              </m:r>
+                              <m:sSup>
+                                <m:e>
+                                  <m:r>
+                                    <m:t>10</m:t>
+                                  </m:r>
+                                </m:e>
+                                <m:sup>
+                                  <m:r>
+                                    <m:t>6</m:t>
+                                  </m:r>
+                                </m:sup>
+                              </m:sSup>
+                            </m:e>
+                          </m:d>
+                        </m:e>
+                        <m:sup>
+                          <m:r>
+                            <m:t>2</m:t>
+                          </m:r>
+                        </m:sup>
+                      </m:sSup>
+                    </m:num>
+                    <m:den>
+                      <m:r>
+                        <m:t>4</m:t>
+                      </m:r>
+                      <m:sSup>
+                        <m:e>
+                          <m:r>
+                            <m:t>π</m:t>
+                          </m:r>
+                        </m:e>
+                        <m:sup>
+                          <m:r>
+                            <m:t>2</m:t>
+                          </m:r>
+                        </m:sup>
+                      </m:sSup>
+                    </m:den>
+                  </m:f>
+                </m:e>
+              </m:d>
+            </m:e>
+            <m:sup>
+              <m:r>
+                <m:t>1</m:t>
+              </m:r>
+              <m:r>
+                <m:rPr>
+                  <m:sty m:val="p"/>
+                </m:rPr>
+                <m:t>/</m:t>
+              </m:r>
+              <m:r>
+                <m:t>3</m:t>
+              </m:r>
+            </m:sup>
+          </m:sSup>
+          <m:r>
+            <m:rPr>
+              <m:nor/>
+              <m:sty m:val="p"/>
+            </m:rPr>
+            <m:t> m</m:t>
+          </m:r>
+          <m:r>
+            <m:rPr>
+              <m:sty m:val="p"/>
+            </m:rPr>
+            <m:t>=</m:t>
+          </m:r>
+          <m:r>
+            <m:t>3</m:t>
+          </m:r>
+          <m:r>
+            <m:rPr>
+              <m:sty m:val="p"/>
+            </m:rPr>
+            <m:t>,</m:t>
+          </m:r>
+          <m:r>
+            <m:t>83</m:t>
+          </m:r>
+          <m:r>
+            <m:rPr>
+              <m:sty m:val="p"/>
+            </m:rPr>
+            <m:t>⋅</m:t>
+          </m:r>
+          <m:sSup>
+            <m:e>
+              <m:r>
+                <m:t>10</m:t>
+              </m:r>
+            </m:e>
+            <m:sup>
+              <m:r>
+                <m:t>8</m:t>
+              </m:r>
+            </m:sup>
+          </m:sSup>
+          <m:r>
+            <m:rPr>
+              <m:nor/>
+              <m:sty m:val="p"/>
+            </m:rPr>
+            <m:t> m</m:t>
+          </m:r>
+          <m:r>
+            <m:rPr>
+              <m:sty m:val="p"/>
+            </m:rPr>
+            <m:t>=</m:t>
+          </m:r>
+          <m:r>
+            <m:t>383</m:t>
+          </m:r>
+          <m:r>
+            <m:t> </m:t>
+          </m:r>
+          <m:r>
+            <m:t>000</m:t>
+          </m:r>
+          <m:r>
+            <m:rPr>
+              <m:nor/>
+              <m:sty m:val="p"/>
+            </m:rPr>
+            <m:t> km</m:t>
+          </m:r>
+          <m:r>
+            <m:rPr>
+              <m:sty m:val="p"/>
+            </m:rPr>
+            <m:t>.</m:t>
+          </m:r>
+        </m:oMath>
+      </m:oMathPara>
+    </w:p>
+    <w:p>
+      <w:pPr>
+        <w:pStyle w:val="FirstParagraph"/>
+      </w:pPr>
+      <w:r>
+        <w:t xml:space="preserve">Det er 60,1 jordradier og kun 0,4 % fra Månens middelafstand på 384 400 km.</w:t>
+      </w:r>
+    </w:p>
+    <w:bookmarkEnd w:id="44"/>
+    <w:bookmarkStart w:id="45" w:name="spørgsmål-til-del-2"/>
+    <w:p>
+      <w:pPr>
+        <w:pStyle w:val="Heading2"/>
+      </w:pPr>
+      <w:r>
+        <w:t xml:space="preserve">Spørgsmål til del 2</w:t>
+      </w:r>
+    </w:p>
+    <w:p>
+      <w:pPr>
+        <w:numPr>
+          <w:ilvl w:val="0"/>
+          <w:numId w:val="1007"/>
+        </w:numPr>
+        <w:pStyle w:val="Compact"/>
+      </w:pPr>
+      <w:r>
+        <w:t xml:space="preserve">Hvorfor skal man bruge den sideriske måned (27,32 døgn) og ikke tiden fra fuldmåne til fuldmåne (29,53 døgn)? Hvor stor bliver afstanden, hvis man bruger 29,53 døgn?</w:t>
+      </w:r>
+    </w:p>
+    <w:p>
+      <w:pPr>
+        <w:numPr>
+          <w:ilvl w:val="0"/>
+          <w:numId w:val="1007"/>
+        </w:numPr>
+        <w:pStyle w:val="Compact"/>
+      </w:pPr>
+      <w:r>
+        <w:t xml:space="preserve">Hvor stor en fejl i</w:t>
+      </w:r>
+      <w:r>
+        <w:t xml:space="preserve"> </w:t>
+      </w:r>
+      <m:oMath>
+        <m:r>
+          <m:t>D</m:t>
+        </m:r>
+      </m:oMath>
+      <w:r>
+        <w:t xml:space="preserve"> </w:t>
+      </w:r>
+      <w:r>
+        <w:t xml:space="preserve">giver en fejl på 1 % i</w:t>
+      </w:r>
+      <w:r>
+        <w:t xml:space="preserve"> </w:t>
+      </w:r>
+      <m:oMath>
+        <m:r>
+          <m:t>g</m:t>
+        </m:r>
+      </m:oMath>
+      <w:r>
+        <w:t xml:space="preserve">? Og en fejl på 1 % i</w:t>
+      </w:r>
+      <w:r>
+        <w:t xml:space="preserve"> </w:t>
+      </w:r>
+      <m:oMath>
+        <m:r>
+          <m:t>T</m:t>
+        </m:r>
+      </m:oMath>
+      <w:r>
+        <w:t xml:space="preserve">?</w:t>
+      </w:r>
+    </w:p>
+    <w:p>
+      <w:pPr>
+        <w:numPr>
+          <w:ilvl w:val="0"/>
+          <w:numId w:val="1007"/>
+        </w:numPr>
+        <w:pStyle w:val="Compact"/>
+      </w:pPr>
+      <w:r>
+        <w:t xml:space="preserve">Hvorfor ville det være en cirkelslutning at bestemme</w:t>
+      </w:r>
+      <w:r>
+        <w:t xml:space="preserve"> </w:t>
+      </w:r>
+      <m:oMath>
+        <m:r>
+          <m:t>g</m:t>
+        </m:r>
+      </m:oMath>
+      <w:r>
+        <w:t xml:space="preserve"> </w:t>
+      </w:r>
+      <w:r>
+        <w:t xml:space="preserve">med lodder på en kraftmåler?</w:t>
+      </w:r>
+    </w:p>
+    <w:p>
+      <w:pPr>
+        <w:numPr>
+          <w:ilvl w:val="0"/>
+          <w:numId w:val="1007"/>
+        </w:numPr>
+        <w:pStyle w:val="Compact"/>
+      </w:pPr>
+      <w:r>
+        <w:t xml:space="preserve">Sammenlign resultatet med afstanden fra formørkelsen i del 1. Hvad betyder det, at to helt forskellige metoder giver næsten samme svar?</w:t>
+      </w:r>
+    </w:p>
+    <w:p>
+      <w:pPr>
+        <w:numPr>
+          <w:ilvl w:val="0"/>
+          <w:numId w:val="1007"/>
+        </w:numPr>
+        <w:pStyle w:val="Compact"/>
+      </w:pPr>
+      <w:r>
+        <w:t xml:space="preserve">Svaret er 0,3–0,4 % for lille. Månen trækker også i Jorden. Hvordan ændrer det formlen, når Månens masse er 1/81,3 af Jordens?</w:t>
+      </w:r>
+    </w:p>
+    <w:bookmarkEnd w:id="45"/>
+    <w:bookmarkEnd w:id="46"/>
+    <w:bookmarkStart w:id="49" w:name="lærervejledning-og-facit"/>
+    <w:p>
+      <w:pPr>
+        <w:pStyle w:val="Heading1"/>
+      </w:pPr>
+      <w:r>
         <w:t xml:space="preserve">Lærervejledning og facit</w:t>
+      </w:r>
+    </w:p>
+    <w:bookmarkStart w:id="47" w:name="facit-til-del-1"/>
+    <w:p>
+      <w:pPr>
+        <w:pStyle w:val="Heading2"/>
+      </w:pPr>
+      <w:r>
+        <w:t xml:space="preserve">Facit til del 1</w:t>
       </w:r>
     </w:p>
     <w:p>
@@ -4211,7 +6063,727 @@
         <w:t xml:space="preserve">med egne fotografier ligger på 55–65 jordradier. Det er inden for 10 % og fuldt ud på niveau med Hipparch.</w:t>
       </w:r>
     </w:p>
-    <w:bookmarkEnd w:id="40"/>
+    <w:bookmarkEnd w:id="47"/>
+    <w:bookmarkStart w:id="48" w:name="facit-til-del-2"/>
+    <w:p>
+      <w:pPr>
+        <w:pStyle w:val="Heading2"/>
+      </w:pPr>
+      <w:r>
+        <w:t xml:space="preserve">Facit til del 2</w:t>
+      </w:r>
+    </w:p>
+    <w:p>
+      <w:pPr>
+        <w:pStyle w:val="FirstParagraph"/>
+      </w:pPr>
+      <w:r>
+        <w:rPr>
+          <w:bCs/>
+          <w:b/>
+        </w:rPr>
+        <w:t xml:space="preserve">Pendulet.</w:t>
+      </w:r>
+      <w:r>
+        <w:t xml:space="preserve"> </w:t>
+      </w:r>
+      <w:r>
+        <w:t xml:space="preserve">Med</w:t>
+      </w:r>
+      <w:r>
+        <w:t xml:space="preserve"> </w:t>
+      </w:r>
+      <m:oMath>
+        <m:r>
+          <m:t>L</m:t>
+        </m:r>
+        <m:r>
+          <m:rPr>
+            <m:sty m:val="p"/>
+          </m:rPr>
+          <m:t>=</m:t>
+        </m:r>
+        <m:r>
+          <m:t>1</m:t>
+        </m:r>
+        <m:r>
+          <m:rPr>
+            <m:sty m:val="p"/>
+          </m:rPr>
+          <m:t>,</m:t>
+        </m:r>
+        <m:r>
+          <m:t>000</m:t>
+        </m:r>
+      </m:oMath>
+      <w:r>
+        <w:t xml:space="preserve"> </w:t>
+      </w:r>
+      <w:r>
+        <w:t xml:space="preserve">m og</w:t>
+      </w:r>
+      <w:r>
+        <w:t xml:space="preserve"> </w:t>
+      </w:r>
+      <m:oMath>
+        <m:sSub>
+          <m:e>
+            <m:r>
+              <m:t>T</m:t>
+            </m:r>
+          </m:e>
+          <m:sub>
+            <m:r>
+              <m:t>p</m:t>
+            </m:r>
+          </m:sub>
+        </m:sSub>
+        <m:r>
+          <m:rPr>
+            <m:sty m:val="p"/>
+          </m:rPr>
+          <m:t>=</m:t>
+        </m:r>
+        <m:r>
+          <m:t>2</m:t>
+        </m:r>
+        <m:r>
+          <m:rPr>
+            <m:sty m:val="p"/>
+          </m:rPr>
+          <m:t>,</m:t>
+        </m:r>
+        <m:r>
+          <m:t>006</m:t>
+        </m:r>
+      </m:oMath>
+      <w:r>
+        <w:t xml:space="preserve"> </w:t>
+      </w:r>
+      <w:r>
+        <w:t xml:space="preserve">s er</w:t>
+      </w:r>
+      <w:r>
+        <w:t xml:space="preserve"> </w:t>
+      </w:r>
+      <m:oMath>
+        <m:r>
+          <m:t>g</m:t>
+        </m:r>
+        <m:r>
+          <m:rPr>
+            <m:sty m:val="p"/>
+          </m:rPr>
+          <m:t>=</m:t>
+        </m:r>
+        <m:r>
+          <m:t>9</m:t>
+        </m:r>
+        <m:r>
+          <m:rPr>
+            <m:sty m:val="p"/>
+          </m:rPr>
+          <m:t>,</m:t>
+        </m:r>
+        <m:r>
+          <m:t>81</m:t>
+        </m:r>
+        <m:r>
+          <m:t> </m:t>
+        </m:r>
+        <m:r>
+          <m:rPr>
+            <m:sty m:val="p"/>
+          </m:rPr>
+          <m:t>m</m:t>
+        </m:r>
+        <m:r>
+          <m:rPr>
+            <m:sty m:val="p"/>
+          </m:rPr>
+          <m:t>/</m:t>
+        </m:r>
+        <m:sSup>
+          <m:e>
+            <m:r>
+              <m:rPr>
+                <m:sty m:val="p"/>
+              </m:rPr>
+              <m:t>s</m:t>
+            </m:r>
+          </m:e>
+          <m:sup>
+            <m:r>
+              <m:rPr>
+                <m:sty m:val="p"/>
+              </m:rPr>
+              <m:t>2</m:t>
+            </m:r>
+          </m:sup>
+        </m:sSup>
+      </m:oMath>
+      <w:r>
+        <w:t xml:space="preserve">. Gode elevmålinger ligger på 9,7–9,9 m/s². I Danmark er den lokale værdi ca. 9,815 m/s².</w:t>
+      </w:r>
+    </w:p>
+    <w:p>
+      <w:pPr>
+        <w:pStyle w:val="BodyText"/>
+      </w:pPr>
+      <w:r>
+        <w:rPr>
+          <w:bCs/>
+          <w:b/>
+        </w:rPr>
+        <w:t xml:space="preserve">Spørgsmål 7.</w:t>
+      </w:r>
+      <w:r>
+        <w:t xml:space="preserve"> </w:t>
+      </w:r>
+      <w:r>
+        <w:t xml:space="preserve">Fra fuldmåne til fuldmåne skal Månen ikke bare rundt, men også indhente Solen, som Jorden imens er flyttet ca. 29° rundt om. Den synodiske måned er derfor længere end den sideriske:</w:t>
+      </w:r>
+      <w:r>
+        <w:t xml:space="preserve"> </w:t>
+      </w:r>
+      <m:oMath>
+        <m:r>
+          <m:t>1</m:t>
+        </m:r>
+        <m:r>
+          <m:rPr>
+            <m:sty m:val="p"/>
+          </m:rPr>
+          <m:t>/</m:t>
+        </m:r>
+        <m:sSub>
+          <m:e>
+            <m:r>
+              <m:t>T</m:t>
+            </m:r>
+          </m:e>
+          <m:sub>
+            <m:r>
+              <m:t>e</m:t>
+            </m:r>
+          </m:sub>
+        </m:sSub>
+        <m:r>
+          <m:t>x</m:t>
+        </m:r>
+        <m:r>
+          <m:t>t</m:t>
+        </m:r>
+        <m:r>
+          <m:t>s</m:t>
+        </m:r>
+        <m:r>
+          <m:t>y</m:t>
+        </m:r>
+        <m:r>
+          <m:t>n</m:t>
+        </m:r>
+        <m:r>
+          <m:rPr>
+            <m:sty m:val="p"/>
+          </m:rPr>
+          <m:t>=</m:t>
+        </m:r>
+        <m:r>
+          <m:t>1</m:t>
+        </m:r>
+        <m:r>
+          <m:rPr>
+            <m:sty m:val="p"/>
+          </m:rPr>
+          <m:t>/</m:t>
+        </m:r>
+        <m:sSub>
+          <m:e>
+            <m:r>
+              <m:t>T</m:t>
+            </m:r>
+          </m:e>
+          <m:sub>
+            <m:r>
+              <m:t>e</m:t>
+            </m:r>
+          </m:sub>
+        </m:sSub>
+        <m:r>
+          <m:t>x</m:t>
+        </m:r>
+        <m:r>
+          <m:t>t</m:t>
+        </m:r>
+        <m:r>
+          <m:t>s</m:t>
+        </m:r>
+        <m:r>
+          <m:t>i</m:t>
+        </m:r>
+        <m:r>
+          <m:t>d</m:t>
+        </m:r>
+        <m:r>
+          <m:rPr>
+            <m:sty m:val="p"/>
+          </m:rPr>
+          <m:t>−</m:t>
+        </m:r>
+        <m:r>
+          <m:t>1</m:t>
+        </m:r>
+        <m:r>
+          <m:rPr>
+            <m:sty m:val="p"/>
+          </m:rPr>
+          <m:t>/</m:t>
+        </m:r>
+        <m:r>
+          <m:t>e</m:t>
+        </m:r>
+        <m:r>
+          <m:t>x</m:t>
+        </m:r>
+        <m:r>
+          <m:t>t</m:t>
+        </m:r>
+        <m:r>
+          <m:t>å</m:t>
+        </m:r>
+        <m:r>
+          <m:t>r</m:t>
+        </m:r>
+      </m:oMath>
+      <w:r>
+        <w:t xml:space="preserve">. Med 29,53 døgn bliver</w:t>
+      </w:r>
+      <w:r>
+        <w:t xml:space="preserve"> </w:t>
+      </w:r>
+      <m:oMath>
+        <m:r>
+          <m:t>D</m:t>
+        </m:r>
+        <m:r>
+          <m:rPr>
+            <m:sty m:val="p"/>
+          </m:rPr>
+          <m:t>=</m:t>
+        </m:r>
+        <m:r>
+          <m:t>403</m:t>
+        </m:r>
+        <m:r>
+          <m:t> </m:t>
+        </m:r>
+        <m:r>
+          <m:t>400</m:t>
+        </m:r>
+      </m:oMath>
+      <w:r>
+        <w:t xml:space="preserve"> </w:t>
+      </w:r>
+      <w:r>
+        <w:t xml:space="preserve">km, 5 % for stort.</w:t>
+      </w:r>
+    </w:p>
+    <w:p>
+      <w:pPr>
+        <w:pStyle w:val="BodyText"/>
+      </w:pPr>
+      <w:r>
+        <w:rPr>
+          <w:bCs/>
+          <w:b/>
+        </w:rPr>
+        <w:t xml:space="preserve">Spørgsmål 8.</w:t>
+      </w:r>
+      <w:r>
+        <w:t xml:space="preserve"> </w:t>
+      </w:r>
+      <m:oMath>
+        <m:r>
+          <m:t>D</m:t>
+        </m:r>
+        <m:r>
+          <m:rPr>
+            <m:sty m:val="p"/>
+          </m:rPr>
+          <m:t>∝</m:t>
+        </m:r>
+        <m:sSup>
+          <m:e>
+            <m:r>
+              <m:t>g</m:t>
+            </m:r>
+          </m:e>
+          <m:sup>
+            <m:r>
+              <m:t>1</m:t>
+            </m:r>
+            <m:r>
+              <m:rPr>
+                <m:sty m:val="p"/>
+              </m:rPr>
+              <m:t>/</m:t>
+            </m:r>
+            <m:r>
+              <m:t>3</m:t>
+            </m:r>
+          </m:sup>
+        </m:sSup>
+        <m:r>
+          <m:t> </m:t>
+        </m:r>
+        <m:sSup>
+          <m:e>
+            <m:r>
+              <m:t>R</m:t>
+            </m:r>
+          </m:e>
+          <m:sup>
+            <m:r>
+              <m:t>2</m:t>
+            </m:r>
+            <m:r>
+              <m:rPr>
+                <m:sty m:val="p"/>
+              </m:rPr>
+              <m:t>/</m:t>
+            </m:r>
+            <m:r>
+              <m:t>3</m:t>
+            </m:r>
+          </m:sup>
+        </m:sSup>
+        <m:r>
+          <m:t> </m:t>
+        </m:r>
+        <m:sSup>
+          <m:e>
+            <m:r>
+              <m:t>T</m:t>
+            </m:r>
+          </m:e>
+          <m:sup>
+            <m:r>
+              <m:t>2</m:t>
+            </m:r>
+            <m:r>
+              <m:rPr>
+                <m:sty m:val="p"/>
+              </m:rPr>
+              <m:t>/</m:t>
+            </m:r>
+            <m:r>
+              <m:t>3</m:t>
+            </m:r>
+          </m:sup>
+        </m:sSup>
+      </m:oMath>
+      <w:r>
+        <w:t xml:space="preserve">. En fejl på 1 % i</w:t>
+      </w:r>
+      <w:r>
+        <w:t xml:space="preserve"> </w:t>
+      </w:r>
+      <m:oMath>
+        <m:r>
+          <m:t>g</m:t>
+        </m:r>
+      </m:oMath>
+      <w:r>
+        <w:t xml:space="preserve"> </w:t>
+      </w:r>
+      <w:r>
+        <w:t xml:space="preserve">giver 0,33 % i</w:t>
+      </w:r>
+      <w:r>
+        <w:t xml:space="preserve"> </w:t>
+      </w:r>
+      <m:oMath>
+        <m:r>
+          <m:t>D</m:t>
+        </m:r>
+      </m:oMath>
+      <w:r>
+        <w:t xml:space="preserve">; 1 % i</w:t>
+      </w:r>
+      <w:r>
+        <w:t xml:space="preserve"> </w:t>
+      </w:r>
+      <m:oMath>
+        <m:r>
+          <m:t>T</m:t>
+        </m:r>
+      </m:oMath>
+      <w:r>
+        <w:t xml:space="preserve"> </w:t>
+      </w:r>
+      <w:r>
+        <w:t xml:space="preserve">eller</w:t>
+      </w:r>
+      <w:r>
+        <w:t xml:space="preserve"> </w:t>
+      </w:r>
+      <m:oMath>
+        <m:r>
+          <m:t>R</m:t>
+        </m:r>
+      </m:oMath>
+      <w:r>
+        <w:t xml:space="preserve"> </w:t>
+      </w:r>
+      <w:r>
+        <w:t xml:space="preserve">giver 0,67 %. Metoden er derfor meget tilgivende over for usikkerheden på pendulmålingen.</w:t>
+      </w:r>
+    </w:p>
+    <w:p>
+      <w:pPr>
+        <w:pStyle w:val="BodyText"/>
+      </w:pPr>
+      <w:r>
+        <w:rPr>
+          <w:bCs/>
+          <w:b/>
+        </w:rPr>
+        <w:t xml:space="preserve">Spørgsmål 9.</w:t>
+      </w:r>
+      <w:r>
+        <w:t xml:space="preserve"> </w:t>
+      </w:r>
+      <w:r>
+        <w:t xml:space="preserve">En kraftmåler eller vægt er kalibreret i newton ved hjælp af</w:t>
+      </w:r>
+      <w:r>
+        <w:t xml:space="preserve"> </w:t>
+      </w:r>
+      <m:oMath>
+        <m:r>
+          <m:t>g</m:t>
+        </m:r>
+      </m:oMath>
+      <w:r>
+        <w:t xml:space="preserve">: vægten af et lod er</w:t>
+      </w:r>
+      <w:r>
+        <w:t xml:space="preserve"> </w:t>
+      </w:r>
+      <m:oMath>
+        <m:r>
+          <m:t>m</m:t>
+        </m:r>
+        <m:r>
+          <m:rPr>
+            <m:sty m:val="p"/>
+          </m:rPr>
+          <m:t>⋅</m:t>
+        </m:r>
+        <m:r>
+          <m:t>g</m:t>
+        </m:r>
+      </m:oMath>
+      <w:r>
+        <w:t xml:space="preserve">. Måler man</w:t>
+      </w:r>
+      <w:r>
+        <w:t xml:space="preserve"> </w:t>
+      </w:r>
+      <m:oMath>
+        <m:r>
+          <m:t>g</m:t>
+        </m:r>
+      </m:oMath>
+      <w:r>
+        <w:t xml:space="preserve"> </w:t>
+      </w:r>
+      <w:r>
+        <w:t xml:space="preserve">på den måde, får man bare den værdi tilbage, der blev brugt ved kalibreringen.</w:t>
+      </w:r>
+    </w:p>
+    <w:p>
+      <w:pPr>
+        <w:pStyle w:val="BodyText"/>
+      </w:pPr>
+      <w:r>
+        <w:rPr>
+          <w:bCs/>
+          <w:b/>
+        </w:rPr>
+        <w:t xml:space="preserve">Spørgsmål 10.</w:t>
+      </w:r>
+      <w:r>
+        <w:t xml:space="preserve"> </w:t>
+      </w:r>
+      <w:r>
+        <w:t xml:space="preserve">Formørkelsen bruger kun geometri og Solens vinkelstørrelse; del 2 bruger kun mekanik og tyngdeloven. At de giver samme afstand inden for få procent, viser, at Newtons tyngdelov gælder både ved jordoverfladen og ude ved Månen. Det var præcis Newtons egen test i 1666, »månetesten«.</w:t>
+      </w:r>
+    </w:p>
+    <w:p>
+      <w:pPr>
+        <w:pStyle w:val="BodyText"/>
+      </w:pPr>
+      <w:r>
+        <w:rPr>
+          <w:bCs/>
+          <w:b/>
+        </w:rPr>
+        <w:t xml:space="preserve">Spørgsmål 11.</w:t>
+      </w:r>
+      <w:r>
+        <w:t xml:space="preserve"> </w:t>
+      </w:r>
+      <w:r>
+        <w:t xml:space="preserve">Jorden og Månen kredser om deres fælles tyngdepunkt, og i Keplers 3. lov indgår summen af masserne:</w:t>
+      </w:r>
+      <w:r>
+        <w:t xml:space="preserve"> </w:t>
+      </w:r>
+      <m:oMath>
+        <m:r>
+          <m:t>G</m:t>
+        </m:r>
+        <m:d>
+          <m:dPr>
+            <m:begChr m:val="("/>
+            <m:endChr m:val=")"/>
+            <m:sepChr m:val=""/>
+            <m:grow/>
+          </m:dPr>
+          <m:e>
+            <m:r>
+              <m:t>M</m:t>
+            </m:r>
+            <m:r>
+              <m:rPr>
+                <m:sty m:val="p"/>
+              </m:rPr>
+              <m:t>+</m:t>
+            </m:r>
+            <m:sSub>
+              <m:e>
+                <m:r>
+                  <m:t>M</m:t>
+                </m:r>
+              </m:e>
+              <m:sub>
+                <m:r>
+                  <m:rPr>
+                    <m:sty m:val="p"/>
+                  </m:rPr>
+                  <m:t>☾</m:t>
+                </m:r>
+              </m:sub>
+            </m:sSub>
+          </m:e>
+        </m:d>
+      </m:oMath>
+      <w:r>
+        <w:t xml:space="preserve">. Faktoren er</w:t>
+      </w:r>
+      <w:r>
+        <w:t xml:space="preserve"> </w:t>
+      </w:r>
+      <m:oMath>
+        <m:sSup>
+          <m:e>
+            <m:d>
+              <m:dPr>
+                <m:begChr m:val="("/>
+                <m:endChr m:val=")"/>
+                <m:sepChr m:val=""/>
+                <m:grow/>
+              </m:dPr>
+              <m:e>
+                <m:r>
+                  <m:t>1</m:t>
+                </m:r>
+                <m:r>
+                  <m:rPr>
+                    <m:sty m:val="p"/>
+                  </m:rPr>
+                  <m:t>+</m:t>
+                </m:r>
+                <m:r>
+                  <m:t>1</m:t>
+                </m:r>
+                <m:r>
+                  <m:rPr>
+                    <m:sty m:val="p"/>
+                  </m:rPr>
+                  <m:t>/</m:t>
+                </m:r>
+                <m:r>
+                  <m:t>81</m:t>
+                </m:r>
+                <m:r>
+                  <m:rPr>
+                    <m:sty m:val="p"/>
+                  </m:rPr>
+                  <m:t>,</m:t>
+                </m:r>
+                <m:r>
+                  <m:t>3</m:t>
+                </m:r>
+              </m:e>
+            </m:d>
+          </m:e>
+          <m:sup>
+            <m:r>
+              <m:t>1</m:t>
+            </m:r>
+            <m:r>
+              <m:rPr>
+                <m:sty m:val="p"/>
+              </m:rPr>
+              <m:t>/</m:t>
+            </m:r>
+            <m:r>
+              <m:t>3</m:t>
+            </m:r>
+          </m:sup>
+        </m:sSup>
+        <m:r>
+          <m:rPr>
+            <m:sty m:val="p"/>
+          </m:rPr>
+          <m:t>=</m:t>
+        </m:r>
+        <m:r>
+          <m:t>1</m:t>
+        </m:r>
+        <m:r>
+          <m:rPr>
+            <m:sty m:val="p"/>
+          </m:rPr>
+          <m:t>,</m:t>
+        </m:r>
+        <m:r>
+          <m:t>0041</m:t>
+        </m:r>
+      </m:oMath>
+      <w:r>
+        <w:t xml:space="preserve">, så</w:t>
+      </w:r>
+      <w:r>
+        <w:t xml:space="preserve"> </w:t>
+      </w:r>
+      <m:oMath>
+        <m:r>
+          <m:t>D</m:t>
+        </m:r>
+      </m:oMath>
+      <w:r>
+        <w:t xml:space="preserve"> </w:t>
+      </w:r>
+      <w:r>
+        <w:t xml:space="preserve">bliver 384 600 km — 0,05 % fra middelafstanden. Den sidste lille rest skyldes bl.a., at Månens bane ikke er en cirkel, og at Solen forstyrrer den.</w:t>
+      </w:r>
+    </w:p>
+    <w:bookmarkEnd w:id="48"/>
+    <w:bookmarkEnd w:id="49"/>
     <w:sectPr/>
   </w:body>
 </w:document>
@@ -4471,6 +7043,91 @@
     </w:lvl>
     <w:lvl w:ilvl="8">
       <w:start w:val="1"/>
+      <w:numFmt w:val="decimal"/>
+      <w:lvlText w:val="%9."/>
+      <w:lvlJc w:val="left"/>
+      <w:pPr>
+        <w:ind w:left="6480" w:hanging="480"/>
+      </w:pPr>
+    </w:lvl>
+  </w:abstractNum>
+  <w:abstractNum w:abstractNumId="99417">
+    <w:nsid w:val="A99417"/>
+    <w:multiLevelType w:val="multilevel"/>
+    <w:lvl w:ilvl="0">
+      <w:start w:val="7"/>
+      <w:numFmt w:val="decimal"/>
+      <w:lvlText w:val="%1."/>
+      <w:lvlJc w:val="left"/>
+      <w:pPr>
+        <w:ind w:left="720" w:hanging="480"/>
+      </w:pPr>
+    </w:lvl>
+    <w:lvl w:ilvl="1">
+      <w:start w:val="7"/>
+      <w:numFmt w:val="decimal"/>
+      <w:lvlText w:val="%2."/>
+      <w:lvlJc w:val="left"/>
+      <w:pPr>
+        <w:ind w:left="1440" w:hanging="480"/>
+      </w:pPr>
+    </w:lvl>
+    <w:lvl w:ilvl="2">
+      <w:start w:val="7"/>
+      <w:numFmt w:val="decimal"/>
+      <w:lvlText w:val="%3."/>
+      <w:lvlJc w:val="left"/>
+      <w:pPr>
+        <w:ind w:left="2160" w:hanging="480"/>
+      </w:pPr>
+    </w:lvl>
+    <w:lvl w:ilvl="3">
+      <w:start w:val="7"/>
+      <w:numFmt w:val="decimal"/>
+      <w:lvlText w:val="%4."/>
+      <w:lvlJc w:val="left"/>
+      <w:pPr>
+        <w:ind w:left="2880" w:hanging="480"/>
+      </w:pPr>
+    </w:lvl>
+    <w:lvl w:ilvl="4">
+      <w:start w:val="7"/>
+      <w:numFmt w:val="decimal"/>
+      <w:lvlText w:val="%5."/>
+      <w:lvlJc w:val="left"/>
+      <w:pPr>
+        <w:ind w:left="3600" w:hanging="480"/>
+      </w:pPr>
+    </w:lvl>
+    <w:lvl w:ilvl="5">
+      <w:start w:val="7"/>
+      <w:numFmt w:val="decimal"/>
+      <w:lvlText w:val="%6."/>
+      <w:lvlJc w:val="left"/>
+      <w:pPr>
+        <w:ind w:left="4320" w:hanging="480"/>
+      </w:pPr>
+    </w:lvl>
+    <w:lvl w:ilvl="6">
+      <w:start w:val="7"/>
+      <w:numFmt w:val="decimal"/>
+      <w:lvlText w:val="%7."/>
+      <w:lvlJc w:val="left"/>
+      <w:pPr>
+        <w:ind w:left="5040" w:hanging="480"/>
+      </w:pPr>
+    </w:lvl>
+    <w:lvl w:ilvl="7">
+      <w:start w:val="7"/>
+      <w:numFmt w:val="decimal"/>
+      <w:lvlText w:val="%8."/>
+      <w:lvlJc w:val="left"/>
+      <w:pPr>
+        <w:ind w:left="5760" w:hanging="480"/>
+      </w:pPr>
+    </w:lvl>
+    <w:lvl w:ilvl="8">
+      <w:start w:val="7"/>
       <w:numFmt w:val="decimal"/>
       <w:lvlText w:val="%9."/>
       <w:lvlJc w:val="left"/>
@@ -4576,6 +7233,66 @@
     </w:lvlOverride>
     <w:lvlOverride w:ilvl="8">
       <w:startOverride w:val="1"/>
+    </w:lvlOverride>
+  </w:num>
+  <w:num w:numId="1006">
+    <w:abstractNumId w:val="99411"/>
+    <w:lvlOverride w:ilvl="0">
+      <w:startOverride w:val="1"/>
+    </w:lvlOverride>
+    <w:lvlOverride w:ilvl="1">
+      <w:startOverride w:val="1"/>
+    </w:lvlOverride>
+    <w:lvlOverride w:ilvl="2">
+      <w:startOverride w:val="1"/>
+    </w:lvlOverride>
+    <w:lvlOverride w:ilvl="3">
+      <w:startOverride w:val="1"/>
+    </w:lvlOverride>
+    <w:lvlOverride w:ilvl="4">
+      <w:startOverride w:val="1"/>
+    </w:lvlOverride>
+    <w:lvlOverride w:ilvl="5">
+      <w:startOverride w:val="1"/>
+    </w:lvlOverride>
+    <w:lvlOverride w:ilvl="6">
+      <w:startOverride w:val="1"/>
+    </w:lvlOverride>
+    <w:lvlOverride w:ilvl="7">
+      <w:startOverride w:val="1"/>
+    </w:lvlOverride>
+    <w:lvlOverride w:ilvl="8">
+      <w:startOverride w:val="1"/>
+    </w:lvlOverride>
+  </w:num>
+  <w:num w:numId="1007">
+    <w:abstractNumId w:val="99417"/>
+    <w:lvlOverride w:ilvl="0">
+      <w:startOverride w:val="7"/>
+    </w:lvlOverride>
+    <w:lvlOverride w:ilvl="1">
+      <w:startOverride w:val="7"/>
+    </w:lvlOverride>
+    <w:lvlOverride w:ilvl="2">
+      <w:startOverride w:val="7"/>
+    </w:lvlOverride>
+    <w:lvlOverride w:ilvl="3">
+      <w:startOverride w:val="7"/>
+    </w:lvlOverride>
+    <w:lvlOverride w:ilvl="4">
+      <w:startOverride w:val="7"/>
+    </w:lvlOverride>
+    <w:lvlOverride w:ilvl="5">
+      <w:startOverride w:val="7"/>
+    </w:lvlOverride>
+    <w:lvlOverride w:ilvl="6">
+      <w:startOverride w:val="7"/>
+    </w:lvlOverride>
+    <w:lvlOverride w:ilvl="7">
+      <w:startOverride w:val="7"/>
+    </w:lvlOverride>
+    <w:lvlOverride w:ilvl="8">
+      <w:startOverride w:val="7"/>
     </w:lvlOverride>
   </w:num>
 </w:numbering>

</xml_diff>

<commit_message>
Afstanden til Månen: Michaels egne formørkelsesfotos
Værktøjet starter nu med fotoet fra 7. september 2025 (simuleret billede
som alternativ). Nyt afsnit 07 med målingen på det rigtige foto, k ≈ 2,2,
og forklaringen på de ca. 20 %: kantens krumning over en kort, blød bue.
Totalitetsbillede i indledningen. Øvelsesvejledningen opdateret med
samme afsnit og et nyt spørgsmål med facit.

Co-Authored-By: Claude Opus 5.5 <noreply@anthropic.com>
Claude-Session: https://claude.ai/code/session_013wZZbcd8JLzDSkyusgC2RL
</commit_message>
<xml_diff>
--- a/oevelsesvejledning-maanens-afstand.docx
+++ b/oevelsesvejledning-maanens-afstand.docx
@@ -254,7 +254,7 @@
         <w:t xml:space="preserve">mhgfysik.dk/maanens-afstand-formoerkelse.html</w:t>
       </w:r>
     </w:p>
-    <w:bookmarkStart w:id="40" w:name="del-1-jordens-skygge"/>
+    <w:bookmarkStart w:id="44" w:name="del-1-jordens-skygge"/>
     <w:p>
       <w:pPr>
         <w:pStyle w:val="Heading1"/>
@@ -3075,7 +3075,575 @@
       </w:r>
     </w:p>
     <w:bookmarkEnd w:id="36"/>
-    <w:bookmarkStart w:id="37" w:name="fejlkilder"/>
+    <w:bookmarkStart w:id="40" w:name="et-rigtigt-billede-7.-september-2025"/>
+    <w:p>
+      <w:pPr>
+        <w:pStyle w:val="Heading2"/>
+      </w:pPr>
+      <w:r>
+        <w:t xml:space="preserve">Et rigtigt billede: 7. september 2025</w:t>
+      </w:r>
+    </w:p>
+    <w:p>
+      <w:pPr>
+        <w:pStyle w:val="FirstParagraph"/>
+      </w:pPr>
+      <w:r>
+        <w:t xml:space="preserve">Billedet herunder er taget fra Sostrup med en Celestron AstroFi 6 og en mobiltelefon holdt til okularet, kort efter totaliteten. Den lyse sigd er Månen på vej ud af skyggen.</w:t>
+      </w:r>
+    </w:p>
+    <w:p>
+      <w:pPr>
+        <w:pStyle w:val="CaptionedFigure"/>
+      </w:pPr>
+      <w:r>
+        <w:drawing>
+          <wp:inline>
+            <wp:extent cx="3599999" cy="3959999"/>
+            <wp:effectExtent b="0" l="0" r="0" t="0"/>
+            <wp:docPr descr="Fotografi af den delvise formørkelse 7. september 2025 med de to tilpassede cirkler. Månens rand: 570 px. Skyggens kant: ca. 1245 px." title="" id="38" name="Picture"/>
+            <a:graphic>
+              <a:graphicData uri="http://schemas.openxmlformats.org/drawingml/2006/picture">
+                <pic:pic>
+                  <pic:nvPicPr>
+                    <pic:cNvPr descr="/home/claude/formork/eget_foto_cirkler.png" id="39" name="Picture"/>
+                    <pic:cNvPicPr>
+                      <a:picLocks noChangeArrowheads="1" noChangeAspect="1"/>
+                    </pic:cNvPicPr>
+                  </pic:nvPicPr>
+                  <pic:blipFill>
+                    <a:blip r:embed="rId37"/>
+                    <a:stretch>
+                      <a:fillRect/>
+                    </a:stretch>
+                  </pic:blipFill>
+                  <pic:spPr bwMode="auto">
+                    <a:xfrm>
+                      <a:off x="0" y="0"/>
+                      <a:ext cx="3599999" cy="3959999"/>
+                    </a:xfrm>
+                    <a:prstGeom prst="rect">
+                      <a:avLst/>
+                    </a:prstGeom>
+                    <a:noFill/>
+                    <a:ln w="9525">
+                      <a:noFill/>
+                      <a:headEnd/>
+                      <a:tailEnd/>
+                    </a:ln>
+                  </pic:spPr>
+                </pic:pic>
+              </a:graphicData>
+            </a:graphic>
+          </wp:inline>
+        </w:drawing>
+      </w:r>
+    </w:p>
+    <w:p>
+      <w:pPr>
+        <w:pStyle w:val="ImageCaption"/>
+      </w:pPr>
+      <w:r>
+        <w:t xml:space="preserve">Fotografi af den delvise formørkelse 7. september 2025 med de to tilpassede cirkler. Månens rand: 570 px. Skyggens kant: ca. 1245 px.</w:t>
+      </w:r>
+    </w:p>
+    <w:p>
+      <w:pPr>
+        <w:pStyle w:val="BodyText"/>
+      </w:pPr>
+      <w:r>
+        <w:t xml:space="preserve">Cirklerne følger billedet inden for 2–3 pixel. Målingen giver</w:t>
+      </w:r>
+      <w:r>
+        <w:t xml:space="preserve"> </w:t>
+      </w:r>
+      <m:oMath>
+        <m:sSub>
+          <m:e>
+            <m:r>
+              <m:t>r</m:t>
+            </m:r>
+          </m:e>
+          <m:sub>
+            <m:r>
+              <m:t>M</m:t>
+            </m:r>
+          </m:sub>
+        </m:sSub>
+        <m:r>
+          <m:rPr>
+            <m:sty m:val="p"/>
+          </m:rPr>
+          <m:t>=</m:t>
+        </m:r>
+        <m:r>
+          <m:t>570</m:t>
+        </m:r>
+      </m:oMath>
+      <w:r>
+        <w:t xml:space="preserve"> </w:t>
+      </w:r>
+      <w:r>
+        <w:t xml:space="preserve">px og</w:t>
+      </w:r>
+      <w:r>
+        <w:t xml:space="preserve"> </w:t>
+      </w:r>
+      <m:oMath>
+        <m:sSub>
+          <m:e>
+            <m:r>
+              <m:t>r</m:t>
+            </m:r>
+          </m:e>
+          <m:sub>
+            <m:r>
+              <m:t>S</m:t>
+            </m:r>
+          </m:sub>
+        </m:sSub>
+        <m:r>
+          <m:rPr>
+            <m:sty m:val="p"/>
+          </m:rPr>
+          <m:t>≈</m:t>
+        </m:r>
+        <m:r>
+          <m:t>1245</m:t>
+        </m:r>
+      </m:oMath>
+      <w:r>
+        <w:t xml:space="preserve"> </w:t>
+      </w:r>
+      <w:r>
+        <w:t xml:space="preserve">px, så</w:t>
+      </w:r>
+    </w:p>
+    <w:p>
+      <w:pPr>
+        <w:pStyle w:val="BodyText"/>
+      </w:pPr>
+      <m:oMathPara>
+        <m:oMathParaPr>
+          <m:jc m:val="center"/>
+        </m:oMathParaPr>
+        <m:oMath>
+          <m:r>
+            <m:t>k</m:t>
+          </m:r>
+          <m:r>
+            <m:rPr>
+              <m:sty m:val="p"/>
+            </m:rPr>
+            <m:t>≈</m:t>
+          </m:r>
+          <m:f>
+            <m:fPr>
+              <m:type m:val="bar"/>
+            </m:fPr>
+            <m:num>
+              <m:r>
+                <m:t>1245</m:t>
+              </m:r>
+            </m:num>
+            <m:den>
+              <m:r>
+                <m:t>570</m:t>
+              </m:r>
+            </m:den>
+          </m:f>
+          <m:r>
+            <m:rPr>
+              <m:sty m:val="p"/>
+            </m:rPr>
+            <m:t>=</m:t>
+          </m:r>
+          <m:r>
+            <m:t>2</m:t>
+          </m:r>
+          <m:r>
+            <m:rPr>
+              <m:sty m:val="p"/>
+            </m:rPr>
+            <m:t>,</m:t>
+          </m:r>
+          <m:r>
+            <m:t>2</m:t>
+          </m:r>
+          <m:r>
+            <m:rPr>
+              <m:sty m:val="p"/>
+            </m:rPr>
+            <m:t>.</m:t>
+          </m:r>
+        </m:oMath>
+      </m:oMathPara>
+    </w:p>
+    <w:p>
+      <w:pPr>
+        <w:pStyle w:val="FirstParagraph"/>
+      </w:pPr>
+      <w:r>
+        <w:t xml:space="preserve">Afhængigt af præcis hvor på den bløde overgang kanten lægges, ligger</w:t>
+      </w:r>
+      <w:r>
+        <w:t xml:space="preserve"> </w:t>
+      </w:r>
+      <m:oMath>
+        <m:r>
+          <m:t>k</m:t>
+        </m:r>
+      </m:oMath>
+      <w:r>
+        <w:t xml:space="preserve"> </w:t>
+      </w:r>
+      <w:r>
+        <w:t xml:space="preserve">mellem 2,0 og 2,2. Med rettelserne og</w:t>
+      </w:r>
+      <w:r>
+        <w:t xml:space="preserve"> </w:t>
+      </w:r>
+      <m:oMath>
+        <m:r>
+          <m:t>m</m:t>
+        </m:r>
+        <m:r>
+          <m:rPr>
+            <m:sty m:val="p"/>
+          </m:rPr>
+          <m:t>=</m:t>
+        </m:r>
+        <m:r>
+          <m:t>s</m:t>
+        </m:r>
+      </m:oMath>
+      <w:r>
+        <w:t xml:space="preserve"> </w:t>
+      </w:r>
+      <w:r>
+        <w:t xml:space="preserve">giver det</w:t>
+      </w:r>
+    </w:p>
+    <w:tbl>
+      <w:tblPr>
+        <w:tblStyle w:val="Table"/>
+        <w:tblW w:type="auto" w:w="0"/>
+        <w:tblLook w:firstRow="1" w:lastRow="0" w:firstColumn="0" w:lastColumn="0" w:noHBand="0" w:noVBand="0" w:val="0020"/>
+        <w:jc w:val="start"/>
+      </w:tblPr>
+      <w:tblGrid>
+        <w:gridCol w:w="2640"/>
+        <w:gridCol w:w="2640"/>
+        <w:gridCol w:w="2640"/>
+      </w:tblGrid>
+      <w:tr>
+        <w:trPr>
+          <w:tblHeader w:val="true"/>
+        </w:trPr>
+        <w:tc>
+          <w:tcPr/>
+          <w:p>
+            <w:pPr>
+              <w:pStyle w:val="Compact"/>
+              <w:jc w:val="right"/>
+            </w:pPr>
+            <m:oMath>
+              <m:r>
+                <m:t>k</m:t>
+              </m:r>
+            </m:oMath>
+          </w:p>
+        </w:tc>
+        <w:tc>
+          <w:tcPr/>
+          <w:p>
+            <w:pPr>
+              <w:pStyle w:val="Compact"/>
+              <w:jc w:val="right"/>
+            </w:pPr>
+            <m:oMath>
+              <m:r>
+                <m:t>D</m:t>
+              </m:r>
+              <m:r>
+                <m:rPr>
+                  <m:sty m:val="p"/>
+                </m:rPr>
+                <m:t>/</m:t>
+              </m:r>
+              <m:r>
+                <m:t>R</m:t>
+              </m:r>
+            </m:oMath>
+            <w:r>
+              <w:t xml:space="preserve"> </w:t>
+            </w:r>
+            <w:r>
+              <w:t xml:space="preserve">med rettelser</w:t>
+            </w:r>
+          </w:p>
+        </w:tc>
+        <w:tc>
+          <w:tcPr/>
+          <w:p>
+            <w:pPr>
+              <w:pStyle w:val="Compact"/>
+              <w:jc w:val="right"/>
+            </w:pPr>
+            <w:r>
+              <w:t xml:space="preserve">Afvigelse fra 57,9</w:t>
+            </w:r>
+          </w:p>
+        </w:tc>
+      </w:tr>
+      <w:tr>
+        <w:tc>
+          <w:tcPr/>
+          <w:p>
+            <w:pPr>
+              <w:pStyle w:val="Compact"/>
+              <w:jc w:val="right"/>
+            </w:pPr>
+            <w:r>
+              <w:t xml:space="preserve">2,22</w:t>
+            </w:r>
+          </w:p>
+        </w:tc>
+        <w:tc>
+          <w:tcPr/>
+          <w:p>
+            <w:pPr>
+              <w:pStyle w:val="Compact"/>
+              <w:jc w:val="right"/>
+            </w:pPr>
+            <w:r>
+              <w:t xml:space="preserve">68,4</w:t>
+            </w:r>
+          </w:p>
+        </w:tc>
+        <w:tc>
+          <w:tcPr/>
+          <w:p>
+            <w:pPr>
+              <w:pStyle w:val="Compact"/>
+              <w:jc w:val="right"/>
+            </w:pPr>
+            <w:r>
+              <w:t xml:space="preserve">+18 %</w:t>
+            </w:r>
+          </w:p>
+        </w:tc>
+      </w:tr>
+      <w:tr>
+        <w:tc>
+          <w:tcPr/>
+          <w:p>
+            <w:pPr>
+              <w:pStyle w:val="Compact"/>
+              <w:jc w:val="right"/>
+            </w:pPr>
+            <w:r>
+              <w:t xml:space="preserve">2,18</w:t>
+            </w:r>
+          </w:p>
+        </w:tc>
+        <w:tc>
+          <w:tcPr/>
+          <w:p>
+            <w:pPr>
+              <w:pStyle w:val="Compact"/>
+              <w:jc w:val="right"/>
+            </w:pPr>
+            <w:r>
+              <w:t xml:space="preserve">69,2</w:t>
+            </w:r>
+          </w:p>
+        </w:tc>
+        <w:tc>
+          <w:tcPr/>
+          <w:p>
+            <w:pPr>
+              <w:pStyle w:val="Compact"/>
+              <w:jc w:val="right"/>
+            </w:pPr>
+            <w:r>
+              <w:t xml:space="preserve">+19 %</w:t>
+            </w:r>
+          </w:p>
+        </w:tc>
+      </w:tr>
+      <w:tr>
+        <w:tc>
+          <w:tcPr/>
+          <w:p>
+            <w:pPr>
+              <w:pStyle w:val="Compact"/>
+              <w:jc w:val="right"/>
+            </w:pPr>
+            <w:r>
+              <w:t xml:space="preserve">2,04</w:t>
+            </w:r>
+          </w:p>
+        </w:tc>
+        <w:tc>
+          <w:tcPr/>
+          <w:p>
+            <w:pPr>
+              <w:pStyle w:val="Compact"/>
+              <w:jc w:val="right"/>
+            </w:pPr>
+            <w:r>
+              <w:t xml:space="preserve">72,4</w:t>
+            </w:r>
+          </w:p>
+        </w:tc>
+        <w:tc>
+          <w:tcPr/>
+          <w:p>
+            <w:pPr>
+              <w:pStyle w:val="Compact"/>
+              <w:jc w:val="right"/>
+            </w:pPr>
+            <w:r>
+              <w:t xml:space="preserve">+25 %</w:t>
+            </w:r>
+          </w:p>
+        </w:tc>
+      </w:tr>
+    </w:tbl>
+    <w:p>
+      <w:pPr>
+        <w:pStyle w:val="BodyText"/>
+      </w:pPr>
+      <w:r>
+        <w:t xml:space="preserve">Fotoet giver altså ca. 20 % for meget. Det er på niveau med Hipparch, men langt fra simuleringens præcision.</w:t>
+      </w:r>
+    </w:p>
+    <w:p>
+      <w:pPr>
+        <w:pStyle w:val="BodyText"/>
+      </w:pPr>
+      <w:r>
+        <w:rPr>
+          <w:bCs/>
+          <w:b/>
+        </w:rPr>
+        <w:t xml:space="preserve">Hvorfor?</w:t>
+      </w:r>
+      <w:r>
+        <w:t xml:space="preserve"> </w:t>
+      </w:r>
+      <w:r>
+        <w:t xml:space="preserve">Kantens</w:t>
+      </w:r>
+      <w:r>
+        <w:t xml:space="preserve"> </w:t>
+      </w:r>
+      <w:r>
+        <w:rPr>
+          <w:iCs/>
+          <w:i/>
+        </w:rPr>
+        <w:t xml:space="preserve">placering</w:t>
+      </w:r>
+      <w:r>
+        <w:t xml:space="preserve"> </w:t>
+      </w:r>
+      <w:r>
+        <w:t xml:space="preserve">er målt godt, men dens</w:t>
+      </w:r>
+      <w:r>
+        <w:t xml:space="preserve"> </w:t>
+      </w:r>
+      <w:r>
+        <w:rPr>
+          <w:iCs/>
+          <w:i/>
+        </w:rPr>
+        <w:t xml:space="preserve">krumning</w:t>
+      </w:r>
+      <w:r>
+        <w:t xml:space="preserve"> </w:t>
+      </w:r>
+      <w:r>
+        <w:t xml:space="preserve">er det ikke. Skyggens kant er kun en bue på ca. 50° af en stor cirkel. Over buen er forskellen på en cirkel med radius 1245 px og en med den sande radius</w:t>
+      </w:r>
+      <w:r>
+        <w:t xml:space="preserve"> </w:t>
+      </w:r>
+      <m:oMath>
+        <m:r>
+          <m:t>2</m:t>
+        </m:r>
+        <m:r>
+          <m:rPr>
+            <m:sty m:val="p"/>
+          </m:rPr>
+          <m:t>,</m:t>
+        </m:r>
+        <m:r>
+          <m:t>748</m:t>
+        </m:r>
+        <m:r>
+          <m:rPr>
+            <m:sty m:val="p"/>
+          </m:rPr>
+          <m:t>⋅</m:t>
+        </m:r>
+        <m:r>
+          <m:t>570</m:t>
+        </m:r>
+        <m:r>
+          <m:rPr>
+            <m:sty m:val="p"/>
+          </m:rPr>
+          <m:t>=</m:t>
+        </m:r>
+        <m:r>
+          <m:t>1566</m:t>
+        </m:r>
+      </m:oMath>
+      <w:r>
+        <w:t xml:space="preserve"> </w:t>
+      </w:r>
+      <w:r>
+        <w:t xml:space="preserve">px kun ca. 25 px i buens midte. Den forskel skal måles på en overgang, der er 100–200 px bred, fordi halvskyggen glider jævnt over i kerneskyggen. Fittet kan ikke skelne en mindre skygge tæt på Månen fra en større skygge længere væk; begge går gennem de samme punkter.</w:t>
+      </w:r>
+    </w:p>
+    <w:p>
+      <w:pPr>
+        <w:pStyle w:val="BodyText"/>
+      </w:pPr>
+      <w:r>
+        <w:rPr>
+          <w:bCs/>
+          <w:b/>
+        </w:rPr>
+        <w:t xml:space="preserve">Bedre billeder:</w:t>
+      </w:r>
+      <w:r>
+        <w:t xml:space="preserve"> </w:t>
+      </w:r>
+      <w:r>
+        <w:t xml:space="preserve">Fotografér midt i den delvise fase, når skyggen dækker omkring halvdelen af Månen, så buen bliver længst. Hold eksponeringen så kort, at den lyse del ikke bliver overbelyst, og fokusér skarpt. Mål på flere billeder fra samme aften: den sande</w:t>
+      </w:r>
+      <w:r>
+        <w:t xml:space="preserve"> </w:t>
+      </w:r>
+      <m:oMath>
+        <m:r>
+          <m:t>k</m:t>
+        </m:r>
+      </m:oMath>
+      <w:r>
+        <w:t xml:space="preserve"> </w:t>
+      </w:r>
+      <w:r>
+        <w:t xml:space="preserve">er den samme på dem alle.</w:t>
+      </w:r>
+    </w:p>
+    <w:bookmarkEnd w:id="40"/>
+    <w:bookmarkStart w:id="41" w:name="fejlkilder"/>
     <w:p>
       <w:pPr>
         <w:pStyle w:val="Heading2"/>
@@ -3242,8 +3810,8 @@
         <w:t xml:space="preserve">Gør skyggen ca. 2 % større.</w:t>
       </w:r>
     </w:p>
-    <w:bookmarkEnd w:id="37"/>
-    <w:bookmarkStart w:id="38" w:name="spørgsmål"/>
+    <w:bookmarkEnd w:id="41"/>
+    <w:bookmarkStart w:id="42" w:name="spørgsmål"/>
     <w:p>
       <w:pPr>
         <w:pStyle w:val="Heading2"/>
@@ -3448,8 +4016,52 @@
         <w:t xml:space="preserve">kan I tillade, hvis afstanden skal bestemmes med 5 % nøjagtighed?</w:t>
       </w:r>
     </w:p>
-    <w:bookmarkEnd w:id="38"/>
-    <w:bookmarkStart w:id="39" w:name="X6b0a464ebbc6bc31b8a9f8d616ed6b40b95e130"/>
+    <w:p>
+      <w:pPr>
+        <w:numPr>
+          <w:ilvl w:val="0"/>
+          <w:numId w:val="1005"/>
+        </w:numPr>
+        <w:pStyle w:val="Compact"/>
+      </w:pPr>
+      <w:r>
+        <w:t xml:space="preserve">Fotoet fra 7. september 2025 giver</w:t>
+      </w:r>
+      <w:r>
+        <w:t xml:space="preserve"> </w:t>
+      </w:r>
+      <m:oMath>
+        <m:r>
+          <m:t>k</m:t>
+        </m:r>
+        <m:r>
+          <m:rPr>
+            <m:sty m:val="p"/>
+          </m:rPr>
+          <m:t>≈</m:t>
+        </m:r>
+        <m:r>
+          <m:t>2</m:t>
+        </m:r>
+        <m:r>
+          <m:rPr>
+            <m:sty m:val="p"/>
+          </m:rPr>
+          <m:t>,</m:t>
+        </m:r>
+        <m:r>
+          <m:t>2</m:t>
+        </m:r>
+      </m:oMath>
+      <w:r>
+        <w:t xml:space="preserve"> </w:t>
+      </w:r>
+      <w:r>
+        <w:t xml:space="preserve">i stedet for 2,75. Beregn krumningspilen — afstanden fra korden til buens midte — for en kordelængde på 1050 px og radius 1245 px og 1566 px. Hvorfor er det svært at skelne de to?</w:t>
+      </w:r>
+    </w:p>
+    <w:bookmarkEnd w:id="42"/>
+    <w:bookmarkStart w:id="43" w:name="X6b0a464ebbc6bc31b8a9f8d616ed6b40b95e130"/>
     <w:p>
       <w:pPr>
         <w:pStyle w:val="Heading2"/>
@@ -3595,9 +4207,9 @@
         <w:t xml:space="preserve">. Se aldrig direkte på Solen.</w:t>
       </w:r>
     </w:p>
-    <w:bookmarkEnd w:id="39"/>
-    <w:bookmarkEnd w:id="40"/>
-    <w:bookmarkStart w:id="46" w:name="X3fc48ebc3e787dc1977a2fc2b780499d3621e18"/>
+    <w:bookmarkEnd w:id="43"/>
+    <w:bookmarkEnd w:id="44"/>
+    <w:bookmarkStart w:id="50" w:name="X3fc48ebc3e787dc1977a2fc2b780499d3621e18"/>
     <w:p>
       <w:pPr>
         <w:pStyle w:val="Heading1"/>
@@ -3639,7 +4251,7 @@
         <w:t xml:space="preserve">og længden af en måned. Resten er Newtons tyngdelov.</w:t>
       </w:r>
     </w:p>
-    <w:bookmarkStart w:id="41" w:name="trin-1-mål-g-med-et-pendul"/>
+    <w:bookmarkStart w:id="45" w:name="trin-1-mål-g-med-et-pendul"/>
     <w:p>
       <w:pPr>
         <w:pStyle w:val="Heading2"/>
@@ -3925,8 +4537,8 @@
         <w:t xml:space="preserve">. Den forudsætter altså det, man vil måle, og må ikke bruges her.</w:t>
       </w:r>
     </w:p>
-    <w:bookmarkEnd w:id="41"/>
-    <w:bookmarkStart w:id="42" w:name="trin-2-fra-g-til-jordens-masse"/>
+    <w:bookmarkEnd w:id="45"/>
+    <w:bookmarkStart w:id="46" w:name="trin-2-fra-g-til-jordens-masse"/>
     <w:p>
       <w:pPr>
         <w:pStyle w:val="Heading2"/>
@@ -4144,8 +4756,8 @@
         <w:t xml:space="preserve">km. Den kan også måles, som Eratosthenes gjorde.</w:t>
       </w:r>
     </w:p>
-    <w:bookmarkEnd w:id="42"/>
-    <w:bookmarkStart w:id="43" w:name="trin-3-månen-falder-om-jorden"/>
+    <w:bookmarkEnd w:id="46"/>
+    <w:bookmarkStart w:id="47" w:name="trin-3-månen-falder-om-jorden"/>
     <w:p>
       <w:pPr>
         <w:pStyle w:val="Heading2"/>
@@ -4439,8 +5051,8 @@
         <w:t xml:space="preserve">døgn: den tid, Månen er om at komme rundt i forhold til stjernerne.</w:t>
       </w:r>
     </w:p>
-    <w:bookmarkEnd w:id="43"/>
-    <w:bookmarkStart w:id="44" w:name="udregnet-eksempel-1"/>
+    <w:bookmarkEnd w:id="47"/>
+    <w:bookmarkStart w:id="48" w:name="udregnet-eksempel-1"/>
     <w:p>
       <w:pPr>
         <w:pStyle w:val="Heading2"/>
@@ -5254,8 +5866,8 @@
         <w:t xml:space="preserve">Det er 60,1 jordradier og kun 0,4 % fra Månens middelafstand på 384 400 km.</w:t>
       </w:r>
     </w:p>
-    <w:bookmarkEnd w:id="44"/>
-    <w:bookmarkStart w:id="45" w:name="spørgsmål-til-del-2"/>
+    <w:bookmarkEnd w:id="48"/>
+    <w:bookmarkStart w:id="49" w:name="spørgsmål-til-del-2"/>
     <w:p>
       <w:pPr>
         <w:pStyle w:val="Heading2"/>
@@ -5374,9 +5986,9 @@
         <w:t xml:space="preserve">Svaret er 0,3–0,4 % for lille. Månen trækker også i Jorden. Hvordan ændrer det formlen, når Månens masse er 1/81,3 af Jordens?</w:t>
       </w:r>
     </w:p>
-    <w:bookmarkEnd w:id="45"/>
-    <w:bookmarkEnd w:id="46"/>
-    <w:bookmarkStart w:id="49" w:name="lærervejledning-og-facit"/>
+    <w:bookmarkEnd w:id="49"/>
+    <w:bookmarkEnd w:id="50"/>
+    <w:bookmarkStart w:id="53" w:name="lærervejledning-og-facit"/>
     <w:p>
       <w:pPr>
         <w:pStyle w:val="Heading1"/>
@@ -5385,7 +5997,7 @@
         <w:t xml:space="preserve">Lærervejledning og facit</w:t>
       </w:r>
     </w:p>
-    <w:bookmarkStart w:id="47" w:name="facit-til-del-1"/>
+    <w:bookmarkStart w:id="51" w:name="facit-til-del-1"/>
     <w:p>
       <w:pPr>
         <w:pStyle w:val="Heading2"/>
@@ -6062,9 +6674,223 @@
       <w:r>
         <w:t xml:space="preserve">med egne fotografier ligger på 55–65 jordradier. Det er inden for 10 % og fuldt ud på niveau med Hipparch.</w:t>
       </w:r>
-    </w:p>
-    <w:bookmarkEnd w:id="47"/>
-    <w:bookmarkStart w:id="48" w:name="facit-til-del-2"/>
+      <w:r>
+        <w:t xml:space="preserve"> </w:t>
+      </w:r>
+      <w:r>
+        <w:rPr>
+          <w:bCs/>
+          <w:b/>
+        </w:rPr>
+        <w:t xml:space="preserve">Spørgsmål 7.</w:t>
+      </w:r>
+      <w:r>
+        <w:t xml:space="preserve"> </w:t>
+      </w:r>
+      <w:r>
+        <w:t xml:space="preserve">Krumningspilen er</w:t>
+      </w:r>
+      <w:r>
+        <w:t xml:space="preserve"> </w:t>
+      </w:r>
+      <m:oMath>
+        <m:r>
+          <m:t>h</m:t>
+        </m:r>
+        <m:r>
+          <m:rPr>
+            <m:sty m:val="p"/>
+          </m:rPr>
+          <m:t>=</m:t>
+        </m:r>
+        <m:r>
+          <m:t>r</m:t>
+        </m:r>
+        <m:r>
+          <m:rPr>
+            <m:sty m:val="p"/>
+          </m:rPr>
+          <m:t>−</m:t>
+        </m:r>
+        <m:rad>
+          <m:radPr>
+            <m:degHide m:val="on"/>
+          </m:radPr>
+          <m:deg/>
+          <m:e>
+            <m:sSup>
+              <m:e>
+                <m:r>
+                  <m:t>r</m:t>
+                </m:r>
+              </m:e>
+              <m:sup>
+                <m:r>
+                  <m:t>2</m:t>
+                </m:r>
+              </m:sup>
+            </m:sSup>
+            <m:r>
+              <m:rPr>
+                <m:sty m:val="p"/>
+              </m:rPr>
+              <m:t>−</m:t>
+            </m:r>
+            <m:sSup>
+              <m:e>
+                <m:d>
+                  <m:dPr>
+                    <m:begChr m:val="("/>
+                    <m:endChr m:val=")"/>
+                    <m:sepChr m:val=""/>
+                    <m:grow/>
+                  </m:dPr>
+                  <m:e>
+                    <m:r>
+                      <m:t>c</m:t>
+                    </m:r>
+                    <m:r>
+                      <m:rPr>
+                        <m:sty m:val="p"/>
+                      </m:rPr>
+                      <m:t>/</m:t>
+                    </m:r>
+                    <m:r>
+                      <m:t>2</m:t>
+                    </m:r>
+                  </m:e>
+                </m:d>
+              </m:e>
+              <m:sup>
+                <m:r>
+                  <m:t>2</m:t>
+                </m:r>
+              </m:sup>
+            </m:sSup>
+          </m:e>
+        </m:rad>
+      </m:oMath>
+      <w:r>
+        <w:t xml:space="preserve">. Med</w:t>
+      </w:r>
+      <w:r>
+        <w:t xml:space="preserve"> </w:t>
+      </w:r>
+      <m:oMath>
+        <m:r>
+          <m:t>c</m:t>
+        </m:r>
+        <m:r>
+          <m:rPr>
+            <m:sty m:val="p"/>
+          </m:rPr>
+          <m:t>=</m:t>
+        </m:r>
+        <m:r>
+          <m:t>1050</m:t>
+        </m:r>
+      </m:oMath>
+      <w:r>
+        <w:t xml:space="preserve"> </w:t>
+      </w:r>
+      <w:r>
+        <w:t xml:space="preserve">px:</w:t>
+      </w:r>
+      <w:r>
+        <w:t xml:space="preserve"> </w:t>
+      </w:r>
+      <m:oMath>
+        <m:r>
+          <m:t>r</m:t>
+        </m:r>
+        <m:r>
+          <m:rPr>
+            <m:sty m:val="p"/>
+          </m:rPr>
+          <m:t>=</m:t>
+        </m:r>
+        <m:r>
+          <m:t>1245</m:t>
+        </m:r>
+      </m:oMath>
+      <w:r>
+        <w:t xml:space="preserve"> </w:t>
+      </w:r>
+      <w:r>
+        <w:t xml:space="preserve">px giver</w:t>
+      </w:r>
+      <w:r>
+        <w:t xml:space="preserve"> </w:t>
+      </w:r>
+      <m:oMath>
+        <m:r>
+          <m:t>h</m:t>
+        </m:r>
+        <m:r>
+          <m:rPr>
+            <m:sty m:val="p"/>
+          </m:rPr>
+          <m:t>=</m:t>
+        </m:r>
+        <m:r>
+          <m:t>116</m:t>
+        </m:r>
+      </m:oMath>
+      <w:r>
+        <w:t xml:space="preserve"> </w:t>
+      </w:r>
+      <w:r>
+        <w:t xml:space="preserve">px, og</w:t>
+      </w:r>
+      <w:r>
+        <w:t xml:space="preserve"> </w:t>
+      </w:r>
+      <m:oMath>
+        <m:r>
+          <m:t>r</m:t>
+        </m:r>
+        <m:r>
+          <m:rPr>
+            <m:sty m:val="p"/>
+          </m:rPr>
+          <m:t>=</m:t>
+        </m:r>
+        <m:r>
+          <m:t>1566</m:t>
+        </m:r>
+      </m:oMath>
+      <w:r>
+        <w:t xml:space="preserve"> </w:t>
+      </w:r>
+      <w:r>
+        <w:t xml:space="preserve">px giver</w:t>
+      </w:r>
+      <w:r>
+        <w:t xml:space="preserve"> </w:t>
+      </w:r>
+      <m:oMath>
+        <m:r>
+          <m:t>h</m:t>
+        </m:r>
+        <m:r>
+          <m:rPr>
+            <m:sty m:val="p"/>
+          </m:rPr>
+          <m:t>=</m:t>
+        </m:r>
+        <m:r>
+          <m:t>91</m:t>
+        </m:r>
+      </m:oMath>
+      <w:r>
+        <w:t xml:space="preserve"> </w:t>
+      </w:r>
+      <w:r>
+        <w:t xml:space="preserve">px. Forskellen er kun 25 px, mens selve overgangen fra skygge til lys er 100–200 px bred, og mørke have og lyse højland flytter kanten et par pixel. En lille systematisk bøjning af den målte kant er nok til at give en helt anden radius.</w:t>
+      </w:r>
+    </w:p>
+    <w:bookmarkEnd w:id="51"/>
+    <w:bookmarkStart w:id="52" w:name="facit-til-del-2"/>
     <w:p>
       <w:pPr>
         <w:pStyle w:val="Heading2"/>
@@ -6235,7 +7061,7 @@
           <w:bCs/>
           <w:b/>
         </w:rPr>
-        <w:t xml:space="preserve">Spørgsmål 7.</w:t>
+        <w:t xml:space="preserve">Spørgsmål 8.</w:t>
       </w:r>
       <w:r>
         <w:t xml:space="preserve"> </w:t>
@@ -6398,7 +7224,7 @@
           <w:bCs/>
           <w:b/>
         </w:rPr>
-        <w:t xml:space="preserve">Spørgsmål 8.</w:t>
+        <w:t xml:space="preserve">Spørgsmål 9.</w:t>
       </w:r>
       <w:r>
         <w:t xml:space="preserve"> </w:t>
@@ -6549,7 +7375,7 @@
           <w:bCs/>
           <w:b/>
         </w:rPr>
-        <w:t xml:space="preserve">Spørgsmål 9.</w:t>
+        <w:t xml:space="preserve">Spørgsmål 10.</w:t>
       </w:r>
       <w:r>
         <w:t xml:space="preserve"> </w:t>
@@ -6601,24 +7427,6 @@
       </w:r>
       <w:r>
         <w:t xml:space="preserve">på den måde, får man bare den værdi tilbage, der blev brugt ved kalibreringen.</w:t>
-      </w:r>
-    </w:p>
-    <w:p>
-      <w:pPr>
-        <w:pStyle w:val="BodyText"/>
-      </w:pPr>
-      <w:r>
-        <w:rPr>
-          <w:bCs/>
-          <w:b/>
-        </w:rPr>
-        <w:t xml:space="preserve">Spørgsmål 10.</w:t>
-      </w:r>
-      <w:r>
-        <w:t xml:space="preserve"> </w:t>
-      </w:r>
-      <w:r>
-        <w:t xml:space="preserve">Formørkelsen bruger kun geometri og Solens vinkelstørrelse; del 2 bruger kun mekanik og tyngdeloven. At de giver samme afstand inden for få procent, viser, at Newtons tyngdelov gælder både ved jordoverfladen og ude ved Månen. Det var præcis Newtons egen test i 1666, »månetesten«.</w:t>
       </w:r>
     </w:p>
     <w:p>
@@ -6631,6 +7439,24 @@
           <w:b/>
         </w:rPr>
         <w:t xml:space="preserve">Spørgsmål 11.</w:t>
+      </w:r>
+      <w:r>
+        <w:t xml:space="preserve"> </w:t>
+      </w:r>
+      <w:r>
+        <w:t xml:space="preserve">Formørkelsen bruger kun geometri og Solens vinkelstørrelse; del 2 bruger kun mekanik og tyngdeloven. At de giver samme afstand inden for få procent, viser, at Newtons tyngdelov gælder både ved jordoverfladen og ude ved Månen. Det var præcis Newtons egen test i 1666, »månetesten«.</w:t>
+      </w:r>
+    </w:p>
+    <w:p>
+      <w:pPr>
+        <w:pStyle w:val="BodyText"/>
+      </w:pPr>
+      <w:r>
+        <w:rPr>
+          <w:bCs/>
+          <w:b/>
+        </w:rPr>
+        <w:t xml:space="preserve">Spørgsmål 12.</w:t>
       </w:r>
       <w:r>
         <w:t xml:space="preserve"> </w:t>
@@ -6782,8 +7608,8 @@
         <w:t xml:space="preserve">bliver 384 600 km — 0,05 % fra middelafstanden. Den sidste lille rest skyldes bl.a., at Månens bane ikke er en cirkel, og at Solen forstyrrer den.</w:t>
       </w:r>
     </w:p>
-    <w:bookmarkEnd w:id="48"/>
-    <w:bookmarkEnd w:id="49"/>
+    <w:bookmarkEnd w:id="52"/>
+    <w:bookmarkEnd w:id="53"/>
     <w:sectPr/>
   </w:body>
 </w:document>
@@ -7051,11 +7877,11 @@
       </w:pPr>
     </w:lvl>
   </w:abstractNum>
-  <w:abstractNum w:abstractNumId="99417">
-    <w:nsid w:val="A99417"/>
+  <w:abstractNum w:abstractNumId="99418">
+    <w:nsid w:val="A99418"/>
     <w:multiLevelType w:val="multilevel"/>
     <w:lvl w:ilvl="0">
-      <w:start w:val="7"/>
+      <w:start w:val="8"/>
       <w:numFmt w:val="decimal"/>
       <w:lvlText w:val="%1."/>
       <w:lvlJc w:val="left"/>
@@ -7064,7 +7890,7 @@
       </w:pPr>
     </w:lvl>
     <w:lvl w:ilvl="1">
-      <w:start w:val="7"/>
+      <w:start w:val="8"/>
       <w:numFmt w:val="decimal"/>
       <w:lvlText w:val="%2."/>
       <w:lvlJc w:val="left"/>
@@ -7073,7 +7899,7 @@
       </w:pPr>
     </w:lvl>
     <w:lvl w:ilvl="2">
-      <w:start w:val="7"/>
+      <w:start w:val="8"/>
       <w:numFmt w:val="decimal"/>
       <w:lvlText w:val="%3."/>
       <w:lvlJc w:val="left"/>
@@ -7082,7 +7908,7 @@
       </w:pPr>
     </w:lvl>
     <w:lvl w:ilvl="3">
-      <w:start w:val="7"/>
+      <w:start w:val="8"/>
       <w:numFmt w:val="decimal"/>
       <w:lvlText w:val="%4."/>
       <w:lvlJc w:val="left"/>
@@ -7091,7 +7917,7 @@
       </w:pPr>
     </w:lvl>
     <w:lvl w:ilvl="4">
-      <w:start w:val="7"/>
+      <w:start w:val="8"/>
       <w:numFmt w:val="decimal"/>
       <w:lvlText w:val="%5."/>
       <w:lvlJc w:val="left"/>
@@ -7100,7 +7926,7 @@
       </w:pPr>
     </w:lvl>
     <w:lvl w:ilvl="5">
-      <w:start w:val="7"/>
+      <w:start w:val="8"/>
       <w:numFmt w:val="decimal"/>
       <w:lvlText w:val="%6."/>
       <w:lvlJc w:val="left"/>
@@ -7109,7 +7935,7 @@
       </w:pPr>
     </w:lvl>
     <w:lvl w:ilvl="6">
-      <w:start w:val="7"/>
+      <w:start w:val="8"/>
       <w:numFmt w:val="decimal"/>
       <w:lvlText w:val="%7."/>
       <w:lvlJc w:val="left"/>
@@ -7118,7 +7944,7 @@
       </w:pPr>
     </w:lvl>
     <w:lvl w:ilvl="7">
-      <w:start w:val="7"/>
+      <w:start w:val="8"/>
       <w:numFmt w:val="decimal"/>
       <w:lvlText w:val="%8."/>
       <w:lvlJc w:val="left"/>
@@ -7127,7 +7953,7 @@
       </w:pPr>
     </w:lvl>
     <w:lvl w:ilvl="8">
-      <w:start w:val="7"/>
+      <w:start w:val="8"/>
       <w:numFmt w:val="decimal"/>
       <w:lvlText w:val="%9."/>
       <w:lvlJc w:val="left"/>
@@ -7266,33 +8092,33 @@
     </w:lvlOverride>
   </w:num>
   <w:num w:numId="1007">
-    <w:abstractNumId w:val="99417"/>
+    <w:abstractNumId w:val="99418"/>
     <w:lvlOverride w:ilvl="0">
-      <w:startOverride w:val="7"/>
+      <w:startOverride w:val="8"/>
     </w:lvlOverride>
     <w:lvlOverride w:ilvl="1">
-      <w:startOverride w:val="7"/>
+      <w:startOverride w:val="8"/>
     </w:lvlOverride>
     <w:lvlOverride w:ilvl="2">
-      <w:startOverride w:val="7"/>
+      <w:startOverride w:val="8"/>
     </w:lvlOverride>
     <w:lvlOverride w:ilvl="3">
-      <w:startOverride w:val="7"/>
+      <w:startOverride w:val="8"/>
     </w:lvlOverride>
     <w:lvlOverride w:ilvl="4">
-      <w:startOverride w:val="7"/>
+      <w:startOverride w:val="8"/>
     </w:lvlOverride>
     <w:lvlOverride w:ilvl="5">
-      <w:startOverride w:val="7"/>
+      <w:startOverride w:val="8"/>
     </w:lvlOverride>
     <w:lvlOverride w:ilvl="6">
-      <w:startOverride w:val="7"/>
+      <w:startOverride w:val="8"/>
     </w:lvlOverride>
     <w:lvlOverride w:ilvl="7">
-      <w:startOverride w:val="7"/>
+      <w:startOverride w:val="8"/>
     </w:lvlOverride>
     <w:lvlOverride w:ilvl="8">
-      <w:startOverride w:val="7"/>
+      <w:startOverride w:val="8"/>
     </w:lvlOverride>
   </w:num>
 </w:numbering>

</xml_diff>